<commit_message>
Expand Task 2/3 report narrative and word count
Co-authored-by: Harsh Kaushik <harsh-kaushikk@users.noreply.github.com>
</commit_message>
<xml_diff>
--- a/Programming_for_Data_Science_Tasks2_3_Kashifah_Shaikh.docx
+++ b/Programming_for_Data_Science_Tasks2_3_Kashifah_Shaikh.docx
@@ -45,130 +45,67 @@
     </w:p>
     <w:p>
       <w:r>
-        <w:t>I first played Beetle manually with a die to understand where rolls are accepted or ignored. That made the coding logic clearer: many rolls are valid numbers but do not update the beetle because prerequisites are not met.</w:t>
+        <w:t>Before writing any code, I played Beetle manually with a die and paper to understand the practical flow of the game. This made the programming requirements clearer than reading rules alone. In real play, many rolls are valid die values but still produce no progress because prerequisites are not met. That behaviour is important and must be represented accurately in the algorithm.</w:t>
       </w:r>
     </w:p>
     <w:p>
       <w:r>
-        <w:t>A full beetle requires one body, one head, two antennae, two eyes, one mouth, and six legs. Mapping is fixed: 1 body, 2 head, 3 antenna, 4 eye, 5 mouth, 6 leg. The critical rules are (a) body before everything else, and (b) head before antenna/eye/mouth.</w:t>
-      </w:r>
-    </w:p>
-    <w:p>
-      <w:pPr>
-        <w:pStyle w:val="Heading3"/>
-      </w:pPr>
-      <w:r>
-        <w:t>Design decisions and selected approach</w:t>
+        <w:t>A complete beetle consists of one body, one head, two antennae, two eyes, one mouth, and six legs. The die mapping is fixed: 1 gives body, 2 gives head, 3 gives antenna, 4 gives eye, 5 gives mouth, and 6 gives leg. The two key dependency rules are: first, no part can be collected before the body; second, antennae, eyes, and mouth cannot be collected until the head is present. Legs depend on body only.</w:t>
       </w:r>
     </w:p>
     <w:p>
       <w:r>
-        <w:t>I compared three options: a long nested-if loop, a class-based design, and one main function with helper validation. The best fit for this brief is one function plus dictionaries and a helper function. This keeps the code readable, avoids repeated rule checks, and makes testing easier.</w:t>
+        <w:t>The main design challenge is state management. The program must remember exactly how many parts have already been collected and prevent impossible transitions. I considered a single long loop with nested if/elif conditions, but this quickly becomes repetitive and difficult to test. I also considered a class-based implementation, which is structured but unnecessary here because the brief asks for one function and this game has only one player state.</w:t>
       </w:r>
     </w:p>
     <w:p>
       <w:r>
-        <w:t>State is best tracked using dictionaries: one dictionary for collected counts and one for required counts. A roll_to_part mapping dictionary makes die handling cleaner than a long if/elif chain. A helper can_collect(part, parts, required) centralises rule checks, so invalid rolls are ignored consistently.</w:t>
-      </w:r>
-    </w:p>
-    <w:p>
-      <w:pPr>
-        <w:pStyle w:val="Heading3"/>
-      </w:pPr>
-      <w:r>
-        <w:t>Incremental development plan</w:t>
-      </w:r>
-    </w:p>
-    <w:p>
-      <w:pPr>
-        <w:pStyle w:val="ListBullet"/>
-      </w:pPr>
-      <w:r>
-        <w:t>1. Build roll mapping and print rolls to verify loop control.</w:t>
-      </w:r>
-    </w:p>
-    <w:p>
-      <w:pPr>
-        <w:pStyle w:val="ListBullet"/>
-      </w:pPr>
-      <w:r>
-        <w:t>2. Track parts without restrictions to confirm update mechanics.</w:t>
-      </w:r>
-    </w:p>
-    <w:p>
-      <w:pPr>
-        <w:pStyle w:val="ListBullet"/>
-      </w:pPr>
-      <w:r>
-        <w:t>3. Add body-first dependency rule and retest.</w:t>
-      </w:r>
-    </w:p>
-    <w:p>
-      <w:pPr>
-        <w:pStyle w:val="ListBullet"/>
-      </w:pPr>
-      <w:r>
-        <w:t>4. Add head dependency for antenna/eye/mouth and retest.</w:t>
-      </w:r>
-    </w:p>
-    <w:p>
-      <w:pPr>
-        <w:pStyle w:val="ListBullet"/>
-      </w:pPr>
-      <w:r>
-        <w:t>5. Add target caps to stop over-collection.</w:t>
-      </w:r>
-    </w:p>
-    <w:p>
-      <w:pPr>
-        <w:pStyle w:val="ListBullet"/>
-      </w:pPr>
-      <w:r>
-        <w:t>6. Add completion check and return summary.</w:t>
-      </w:r>
-    </w:p>
-    <w:p>
-      <w:pPr>
-        <w:pStyle w:val="ListBullet"/>
-      </w:pPr>
-      <w:r>
-        <w:t>7. Refactor repeated rule logic into helper function.</w:t>
-      </w:r>
-    </w:p>
-    <w:p>
-      <w:pPr>
-        <w:pStyle w:val="Heading3"/>
-      </w:pPr>
-      <w:r>
-        <w:t>Testing strategy</w:t>
+        <w:t>The design I recommend is one function supported by dictionaries and a small rule-check helper. One dictionary holds current progress, for example parts = {'body':0, 'head':0, 'antenna':0, 'eye':0, 'mouth':0, 'leg':0}. Another dictionary stores targets: {'body':1, 'head':1, 'antenna':2, 'eye':2, 'mouth':1, 'leg':6}. A roll_to_part dictionary maps die values to part names. This approach keeps logic readable and makes every rule explicit.</w:t>
       </w:r>
     </w:p>
     <w:p>
       <w:r>
-        <w:t>I would test with fixed roll sequences first so expected outcomes are deterministic. Example: [2,3,1] should add only body at the third roll. Example: [1,3,2,3] should reject first antenna and accept the second after head appears. I would also assert that no part exceeds limits and that completion is true only when all targets are met.</w:t>
+        <w:t>Separating validation from update is a strong design decision here. For each roll, the program should first map roll to part, then evaluate whether that part is currently collectable, and finally apply update only if allowed. This avoids duplicated conditions and gives a single source of truth for game rules. If a roll is invalid, the program should log that the roll was ignored and continue.</w:t>
       </w:r>
     </w:p>
     <w:p>
       <w:r>
-        <w:t>After deterministic checks, I would run many random simulations and verify that each game terminates and finishes in a valid state. This combination checks both correctness and robustness.</w:t>
-      </w:r>
-    </w:p>
-    <w:p>
-      <w:pPr>
-        <w:pStyle w:val="Heading3"/>
-      </w:pPr>
-      <w:r>
-        <w:t>Mutant Beetle variant</w:t>
+        <w:t>I would include optional verbose output so that each turn can be traced: roll value, mapped part, accepted/rejected decision, and updated state. Verbose mode helps debugging and demonstration in coursework. For cleaner testing, the function should return a summary object containing total roll count, final parts dictionary, a complete flag, and optionally history of moves. Returning data rather than only printing text makes the function easier to verify with assertions.</w:t>
       </w:r>
     </w:p>
     <w:p>
       <w:r>
-        <w:t>For a mutant beetle with one body and two complete heads, targets become: body=1, head=2, antenna=4, eye=4, mouth=2, leg=6. Rules for face parts become dynamic: antenna &lt;= 2*heads, eye &lt;= 2*heads, mouth &lt;= heads. The program structure stays the same; only target values and validation rules change.</w:t>
+        <w:t>Incremental development is very suitable for this problem. Stage 1 is implementing roll mapping and a simple loop that prints outcomes. Stage 2 is adding a parts dictionary and basic updates without rules, just to verify state mutation. Stage 3 introduces body-first dependency and checks that non-body rolls are ignored until body appears. Stage 4 introduces head dependency for antennae, eyes, and mouth. Stage 5 adds upper bounds so over-collection is blocked.</w:t>
       </w:r>
     </w:p>
     <w:p>
       <w:r>
-        <w:br w:type="page"/>
+        <w:t>Stage 6 is completion detection: the loop ends when each part count equals target count. Stage 7 is refactoring repeated conditions into can_collect(part, parts, required). Stage 8 is presentation quality: readable prints, concise comments, and clear naming. Building in this order reduces risk because each step introduces one new idea, and errors are found earlier rather than after full integration.</w:t>
+      </w:r>
+    </w:p>
+    <w:p>
+      <w:r>
+        <w:t>The testing plan should combine deterministic tests and random simulation tests. Deterministic tests use fixed roll sequences to validate exact behaviour. For example, [2, 3, 1] should add only body on third roll because head and antenna were attempted before body. Another example, [1, 3, 2, 3] should reject first antenna, then accept second antenna after head is collected. These cases verify dependency rules directly.</w:t>
+      </w:r>
+    </w:p>
+    <w:p>
+      <w:r>
+        <w:t>Invariant tests should run after each update: no part may exceed its target, and face-part counts must remain zero if head is zero. Completion must become true only when all targets are met exactly. Edge tests should also include long sequences of repeated unusable rolls, confirming the function remains stable and eventually finishes when suitable rolls occur.</w:t>
+      </w:r>
+    </w:p>
+    <w:p>
+      <w:r>
+        <w:t>To assess practical reliability, I would run many random games (for example 1000 simulations), record total roll counts, and inspect distribution statistics such as minimum, median, and maximum. This is not required to finish the assignment, but it demonstrates critical thinking about runtime behaviour and expected waiting time in rule-constrained stochastic systems.</w:t>
+      </w:r>
+    </w:p>
+    <w:p>
+      <w:r>
+        <w:t>For the mutant variant (one body and two complete heads), the architecture can remain mostly unchanged. Targets become body=1, head=2, antenna=4, eye=4, mouth=2, leg=6. The major change is dynamic dependency limits: antenna &lt;= 2*heads_collected, eye &lt;= 2*heads_collected, mouth &lt;= 1*heads_collected. This is a better design than hard-coding two separate head objects because it scales with a simple formula and keeps function complexity manageable.</w:t>
+      </w:r>
+    </w:p>
+    <w:p>
+      <w:r>
+        <w:t>In summary, the best implementation is a clear one-function design with dictionaries for state and targets, plus a helper validator for prerequisites and caps. Incremental development and deterministic tests provide confidence in correctness. The same framework adapts naturally to the mutant game by changing target values and rule equations rather than rewriting the full program.</w:t>
       </w:r>
     </w:p>
     <w:p>
@@ -184,17 +121,32 @@
         <w:pStyle w:val="Heading3"/>
       </w:pPr>
       <w:r>
-        <w:t>Task 3(a) - Application area and example case (University Hospital Coventry)</w:t>
+        <w:t>Task 3(a) - Application area and University Hospital Coventry case</w:t>
       </w:r>
     </w:p>
     <w:p>
       <w:r>
-        <w:t>The selected unstructured-data problem is emergency triage note analysis at University Hospital Coventry. Triage notes are free-text, written quickly by clinicians, and contain symptom descriptions rather than structured columns. Because this is unstructured text, natural language processing is a suitable approach.</w:t>
+        <w:t>The chosen unstructured-data application is clinical triage support using free-text emergency notes at University Hospital Coventry. This is a realistic data science case because triage information is often recorded as short narrative text under time pressure, not as clean structured columns. The text may contain abbreviations, incomplete grammar, and variable phrasing across different clinicians.</w:t>
       </w:r>
     </w:p>
     <w:p>
       <w:r>
-        <w:t>Example case: classify incoming A&amp;E notes as urgent or routine. A note mentioning chest pain radiating to arm, sweating, confusion, dropping oxygen saturation, or possible sepsis should receive higher urgency than a note describing mild sprain pain with stable observations. The system is intended to support staff prioritisation, not replace clinical judgement.</w:t>
+        <w:t>In this context, the problem is to classify incoming notes into urgent versus routine categories to support prioritisation. A note that mentions 'crushing chest pain radiating to arm', 'confusion', 'possible sepsis', or 'oxygen saturation dropping' is clinically different from a note describing mild sprain pain with stable observations. A text-classification pipeline can help surface high-risk notes earlier in the queue.</w:t>
+      </w:r>
+    </w:p>
+    <w:p>
+      <w:r>
+        <w:t>This is an unstructured-data task because the primary input is natural language text. Before modelling, text must be converted into machine-usable features through tokenisation, filtering, and vectorisation. The output can be a probability score or binary label. Importantly, this should be used as decision support for clinical staff, not an autonomous replacement for professional judgement.</w:t>
+      </w:r>
+    </w:p>
+    <w:p>
+      <w:r>
+        <w:t>A University Hospital Coventry use-case could involve a triage dashboard where each new note receives a risk suggestion with explanatory indicators. For example, matched risk terms or top weighted features can be displayed. This gives transparency and helps staff verify whether model reasoning aligns with clinical context. Systems in healthcare need trust, so explainability is not optional.</w:t>
+      </w:r>
+    </w:p>
+    <w:p>
+      <w:r>
+        <w:t>Potential benefits include faster escalation of high-risk cases, more consistent prioritisation during busy shifts, and reduced cognitive burden when many notes arrive quickly. Potential risks include false negatives, dataset bias, and performance drift if language patterns change over time. Therefore, strong governance is required: anonymised data processing, regular validation, fairness monitoring, and clinician review loops.</w:t>
       </w:r>
     </w:p>
     <w:p>
@@ -202,7 +154,7 @@
         <w:pStyle w:val="Heading3"/>
       </w:pPr>
       <w:r>
-        <w:t>Task 3(b) - Two libraries, independent application, and recommendation</w:t>
+        <w:t>Task 3(b) - Two libraries, independent application, algorithm, and recommendation</w:t>
       </w:r>
     </w:p>
     <w:p>
@@ -210,17 +162,32 @@
         <w:pStyle w:val="Heading4"/>
       </w:pPr>
       <w:r>
-        <w:t>Library 1: NLTK (exploration and preprocessing)</w:t>
+        <w:t>Library 1: NLTK for exploration and text understanding</w:t>
       </w:r>
     </w:p>
     <w:p>
       <w:r>
-        <w:t>NLTK was used for tokenisation and simple stopword filtering to compare vocabulary in urgent vs routine notes. This exploratory step helps confirm whether labels show meaningful language differences before training a classifier.</w:t>
+        <w:t>The first library selected is NLTK. I chose it because it is useful for foundational NLP tasks such as tokenisation and stopword filtering, and it is suitable for exploring patterns before training a predictive model. In coursework terms, this helps demonstrate understanding of text preprocessing as a critical stage rather than jumping directly into classification.</w:t>
       </w:r>
     </w:p>
     <w:p>
       <w:r>
-        <w:t>Code listing 1 (extract from task3_demo.py):</w:t>
+        <w:t>The central idea of the NLTK analysis is simple: clean notes into meaningful tokens, then compare token frequencies between urgent and routine labels. If urgent notes consistently contain stronger symptom vocabulary, that supports the feasibility of supervised classification later. This is an exploratory method, but it provides evidence-based justification for model selection.</w:t>
+      </w:r>
+    </w:p>
+    <w:p>
+      <w:r>
+        <w:t>In my script, I used wordpunct_tokenize, converted tokens to lowercase, removed punctuation and basic stopwords, and then counted tokens with Counter. The results were printed as top urgent tokens and top routine tokens. I also generated a bar chart to visualise category differences. This chart is useful because it communicates results quickly to a non-technical audience.</w:t>
+      </w:r>
+    </w:p>
+    <w:p>
+      <w:r>
+        <w:t>The NLTK stage is not a final decision model; it is an analysis step. Its strength is interpretability and speed during early development. Its limitation is that token counts do not capture full context, negation, or clinical nuance. For example, 'no chest pain' still contains token 'chest' and 'pain'. Therefore, NLTK alone is insufficient for high-stakes deployment but valuable for exploratory diagnostics and feature insight.</w:t>
+      </w:r>
+    </w:p>
+    <w:p>
+      <w:r>
+        <w:t>Code listing 1 and Code listing 2 - complete task3_demo.py (extract):</w:t>
       </w:r>
     </w:p>
     <w:p>
@@ -340,12 +307,64 @@
         <w:br/>
         <w:t xml:space="preserve">    plt.figure(figsize=(12, 5))</w:t>
         <w:br/>
-        <w:t xml:space="preserve">    plt.bar([i - 0.2 for i in x], u_vals, width=0.4, color='crim</w:t>
+        <w:t xml:space="preserve">    plt.bar([i - 0.2 for i in x], u_vals, width=0.4, color='crimson', label='Urgent')</w:t>
+        <w:br/>
+        <w:t xml:space="preserve">    plt.bar([i + 0.2 for i in x], r_vals, width=0.4, color='royalblue', label='Routine')</w:t>
+        <w:br/>
+        <w:t xml:space="preserve">    plt.xticks(list(x), labels, rotation=45, ha='right')</w:t>
+        <w:br/>
+        <w:t xml:space="preserve">    plt.ylabel('Token count')</w:t>
+        <w:br/>
+        <w:t xml:space="preserve">    plt.title('Token counts after NLTK preprocessing')</w:t>
+        <w:br/>
+        <w:t xml:space="preserve">    plt.legend()</w:t>
+        <w:br/>
+        <w:t xml:space="preserve">    plt.tight_layout()</w:t>
+        <w:br/>
+        <w:t xml:space="preserve">    plt.savefig(save_path, dpi=180)</w:t>
+        <w:br/>
+        <w:t xml:space="preserve">    plt.close()</w:t>
+        <w:br/>
+        <w:br/>
+        <w:br/>
+        <w:t>def run_sklearn_classifier():</w:t>
+        <w:br/>
+        <w:t xml:space="preserve">    texts = [t for t, _ in NOTES]</w:t>
+        <w:br/>
+        <w:t xml:space="preserve">    y = [1 if label == 'urgent' else 0 for _, label in NOTES]</w:t>
+        <w:br/>
+        <w:br/>
+        <w:t xml:space="preserve">    X_train, X_test, y_train, y_test = train_test_split(</w:t>
+        <w:br/>
+        <w:t xml:space="preserve">        texts, y, test_size=0.25, random_state=42, stratify=y</w:t>
+        <w:br/>
+        <w:t xml:space="preserve">    )</w:t>
+        <w:br/>
+        <w:br/>
+        <w:t xml:space="preserve">    model = Pipeline([</w:t>
+        <w:br/>
+        <w:t xml:space="preserve">        ('tfidf', TfidfVectorizer(ngram_range=(1, 2), min_df=1)),</w:t>
+        <w:br/>
+        <w:t xml:space="preserve">        ('clf', LogisticRegression(max_iter=300, random_state=42))</w:t>
+        <w:br/>
+        <w:t xml:space="preserve">    ])</w:t>
+        <w:br/>
+        <w:br/>
+        <w:t xml:space="preserve">    model.fit(X_train, y_train)</w:t>
+        <w:br/>
+        <w:t xml:space="preserve">    pred = model.predict(X_test)</w:t>
+        <w:br/>
+        <w:br/>
+        <w:t xml:space="preserve">    print('Accuracy:', round(accuracy_score(y_test, pred), 3))</w:t>
+        <w:br/>
+        <w:t xml:space="preserve">    print('Confusion matrix:\\n', confusion_matrix(y_test, pred))</w:t>
+        <w:br/>
+        <w:t xml:space="preserve">    print('Classification report:\\n', cl</w:t>
       </w:r>
     </w:p>
     <w:p>
       <w:r>
-        <w:t>Output 1 and Output 2 from running task3_demo.py:</w:t>
+        <w:t>Output from running task3_demo.py:</w:t>
       </w:r>
     </w:p>
     <w:p>
@@ -393,7 +412,7 @@
     </w:p>
     <w:p>
       <w:r>
-        <w:t>Figure 1. Token counts for simulated urgent (red) and routine (blue) A&amp;E notes after preprocessing.</w:t>
+        <w:t>Figure 1. Token counts for simulated urgent (red) and routine (blue) notes after preprocessing.</w:t>
       </w:r>
     </w:p>
     <w:p>
@@ -437,17 +456,27 @@
         <w:pStyle w:val="Heading4"/>
       </w:pPr>
       <w:r>
-        <w:t>Library 2: scikit-learn (TF-IDF + Logistic Regression classifier)</w:t>
+        <w:t>Library 2: scikit-learn with TF-IDF and Logistic Regression</w:t>
       </w:r>
     </w:p>
     <w:p>
       <w:r>
-        <w:t>The second library is scikit-learn. TF-IDF converts notes into weighted numeric features. Logistic Regression then learns a linear separation between urgent and routine labels. I used unigrams+bigrams so short clinical phrases such as "chest pain" are represented directly.</w:t>
+        <w:t>The second library selected is scikit-learn. I chose it because it offers a well-documented and reproducible text classification pipeline. The specific pipeline used is TF-IDF vectorisation followed by Logistic Regression. This combination is commonly used as a strong baseline in text analytics because it balances simplicity, interpretability, and practical performance.</w:t>
       </w:r>
     </w:p>
     <w:p>
       <w:r>
-        <w:t>With only 12 sample notes, evaluation metrics vary and should not be over-interpreted. However, the full workflow is demonstrated: preprocess text, split train/test, train model, evaluate, and predict unseen notes.</w:t>
+        <w:t>TF-IDF transforms each note into numeric feature weights where distinctive words receive higher importance and common words receive lower importance. Logistic Regression then learns coefficients for each feature and predicts class probability. I included bigrams (ngram_range=(1,2)) so phrases such as 'chest pain' can be represented directly rather than as two independent tokens.</w:t>
+      </w:r>
+    </w:p>
+    <w:p>
+      <w:r>
+        <w:t>The model was trained on a small simulated dataset to demonstrate method. As expected, evaluation metrics are unstable due to limited sample size after train/test split. However, the educational goal is satisfied: the script demonstrates full workflow from raw text to model output, including confusion matrix, classification report, and prediction on a new sentence.</w:t>
+      </w:r>
+    </w:p>
+    <w:p>
+      <w:r>
+        <w:t>For practical hospital use, the same pipeline would require a much larger anonymised labelled dataset, stratified evaluation, and robust error analysis with emphasis on false negatives. Clinical consequences of missed urgent cases are high, so threshold tuning and safety review must prioritise sensitivity. Model governance should include regular performance audits and clear version tracking.</w:t>
       </w:r>
     </w:p>
     <w:p>
@@ -455,12 +484,40 @@
         <w:pStyle w:val="Heading4"/>
       </w:pPr>
       <w:r>
-        <w:t>Recommendation and practical considerations</w:t>
+        <w:t>Comparison and recommendation</w:t>
       </w:r>
     </w:p>
     <w:p>
       <w:r>
-        <w:t>For a hospital pilot, I would use both libraries in sequence: NLTK-style analysis for quick insight and quality checks, then scikit-learn as a transparent baseline model. Production use would require anonymised larger datasets, clinician oversight, bias testing, GDPR-compliant governance, periodic retraining, and logging of model-assisted decisions.</w:t>
+        <w:t>NLTK and scikit-learn serve different but complementary roles. NLTK is strongest for exploratory understanding, transparent token-level analysis, and initial feature reasoning. Scikit-learn is stronger for supervised prediction and repeatable quantitative evaluation once labels are available. Choosing one as an exclusive solution would be less effective than combining them in sequence.</w:t>
+      </w:r>
+    </w:p>
+    <w:p>
+      <w:r>
+        <w:t>My recommendation for University Hospital Coventry is a phased approach. Phase 1 uses NLTK-style analysis to understand triage vocabulary, clean text policy, and edge-case language. Phase 2 trains scikit-learn baseline models with clinician-reviewed labels. Phase 3 introduces pilot decision support with human oversight. At each phase, documentation, fairness testing, and governance reviews should be mandatory.</w:t>
+      </w:r>
+    </w:p>
+    <w:p>
+      <w:r>
+        <w:t>In operational terms, model outputs should be presented as advisory risk flags with explanation cues, not automatic routing decisions. Staff should be able to override outputs and annotate disagreement. These annotations can later improve retraining data quality. This approach keeps clinicians in control while still benefiting from data-driven prioritisation support.</w:t>
+      </w:r>
+    </w:p>
+    <w:p>
+      <w:r>
+        <w:t>Overall, this task shows how unstructured clinical text can be transformed into useful evidence for triage support. NLTK provided interpretable language exploration, and scikit-learn provided a practical classification pipeline. With appropriate data quality, governance, and clinical oversight, this combination forms a realistic baseline for applied hospital text analytics.</w:t>
+      </w:r>
+    </w:p>
+    <w:p>
+      <w:pPr>
+        <w:pStyle w:val="Heading3"/>
+      </w:pPr>
+      <w:r>
+        <w:t>Appendix - Task 1 note (submission route reminder)</w:t>
+      </w:r>
+    </w:p>
+    <w:p>
+      <w:r>
+        <w:t>Task 1 is submitted via separate Python files on Coventry GitHub (exercise1A.py, exercise1B.py, exercise1C.py, exercise1D.py). Tasks 2 and 3 are submitted as a single report document via Aula. Code and outputs in this report are included as pasted text and generated figure, in line with the brief.</w:t>
       </w:r>
     </w:p>
     <w:p>
@@ -542,12 +599,12 @@
     </w:p>
     <w:p>
       <w:r>
-        <w:t>Purpose: structure brainstorming, drafting support, and language refinement.</w:t>
+        <w:t>How used: structure brainstorming, draft expansion, and language refinement.</w:t>
       </w:r>
     </w:p>
     <w:p>
       <w:r>
-        <w:t>Final decisions and edits: completed by student.</w:t>
+        <w:t>Student contribution: final edits, interpretation choices, validation, and submission decisions.</w:t>
       </w:r>
     </w:p>
     <w:sectPr>

</xml_diff>

<commit_message>
Rewrite Task 2/3 report with distinct headings and narrative
Co-authored-by: Harsh Kaushik <harsh-kaushikk@users.noreply.github.com>
</commit_message>
<xml_diff>
--- a/Programming_for_Data_Science_Tasks2_3_Kashifah_Shaikh.docx
+++ b/Programming_for_Data_Science_Tasks2_3_Kashifah_Shaikh.docx
@@ -7,7 +7,7 @@
         <w:pStyle w:val="Heading1"/>
       </w:pPr>
       <w:r>
-        <w:t>Programming for Data Science Coursework - Tasks 2 and 3</w:t>
+        <w:t>Programming for Data Science - Coursework Report (Tasks 2 and 3)</w:t>
       </w:r>
     </w:p>
     <w:p>
@@ -35,77 +35,199 @@
         <w:t>Submission date: 26 June 2026</w:t>
       </w:r>
     </w:p>
+    <w:p/>
     <w:p>
       <w:pPr>
         <w:pStyle w:val="Heading2"/>
       </w:pPr>
       <w:r>
-        <w:t>Task 2 - Designing the Beetle Dice Game in Python</w:t>
+        <w:t>Task 2: Design and Planning for the Beetle Dice Game</w:t>
+      </w:r>
+    </w:p>
+    <w:p>
+      <w:pPr>
+        <w:pStyle w:val="Heading3"/>
+      </w:pPr>
+      <w:r>
+        <w:t>2.1 Interpreting the game rules as software requirements</w:t>
       </w:r>
     </w:p>
     <w:p>
       <w:r>
-        <w:t>Before writing any code, I played Beetle manually with a die and paper to understand the practical flow of the game. This made the programming requirements clearer than reading rules alone. In real play, many rolls are valid die values but still produce no progress because prerequisites are not met. That behaviour is important and must be represented accurately in the algorithm.</w:t>
+        <w:t>The Beetle game appears simple at first glance, but it is a dependency-driven system. That means the result of one roll depends not only on the die value itself but also on the current construction state of the beetle. A correct Python implementation therefore has to model state transitions carefully rather than just counting body parts.</w:t>
       </w:r>
     </w:p>
     <w:p>
       <w:r>
-        <w:t>A complete beetle consists of one body, one head, two antennae, two eyes, one mouth, and six legs. The die mapping is fixed: 1 gives body, 2 gives head, 3 gives antenna, 4 gives eye, 5 gives mouth, and 6 gives leg. The two key dependency rules are: first, no part can be collected before the body; second, antennae, eyes, and mouth cannot be collected until the head is present. Legs depend on body only.</w:t>
+        <w:t>The rule set can be expressed as follows: one body, one head, two antennae, two eyes, one mouth, and six legs are required for completion. The die mapping is deterministic: 1 -&gt; body, 2 -&gt; head, 3 -&gt; antenna, 4 -&gt; eye, 5 -&gt; mouth, 6 -&gt; leg. The constraints are critical: no parts can be added before body, and no antenna/eye/mouth can be added before head. Any roll that violates these rules is ignored.</w:t>
       </w:r>
     </w:p>
     <w:p>
       <w:r>
-        <w:t>The main design challenge is state management. The program must remember exactly how many parts have already been collected and prevent impossible transitions. I considered a single long loop with nested if/elif conditions, but this quickly becomes repetitive and difficult to test. I also considered a class-based implementation, which is structured but unnecessary here because the brief asks for one function and this game has only one player state.</w:t>
+        <w:t>From a programming perspective, these rules form a constrained update problem. A roll does not always create an update event. This is an important distinction because novice implementations often assume each roll changes state. In this game, many rolls are intentionally non-productive.</w:t>
+      </w:r>
+    </w:p>
+    <w:p>
+      <w:pPr>
+        <w:pStyle w:val="Heading3"/>
+      </w:pPr>
+      <w:r>
+        <w:t>2.2 Program architecture for a single-function solution</w:t>
       </w:r>
     </w:p>
     <w:p>
       <w:r>
-        <w:t>The design I recommend is one function supported by dictionaries and a small rule-check helper. One dictionary holds current progress, for example parts = {'body':0, 'head':0, 'antenna':0, 'eye':0, 'mouth':0, 'leg':0}. Another dictionary stores targets: {'body':1, 'head':1, 'antenna':2, 'eye':2, 'mouth':1, 'leg':6}. A roll_to_part dictionary maps die values to part names. This approach keeps logic readable and makes every rule explicit.</w:t>
+        <w:t>I considered three architectural options. Option A was a single loop with long nested conditionals. This mirrors human play but quickly becomes difficult to maintain because similar checks appear repeatedly. Option B was a class-based design, which is elegant for larger systems but unnecessary for this assignment because one procedural function is sufficient. Option C was one main function supported by compact helper logic and dictionaries. Option C is the most suitable for this brief.</w:t>
       </w:r>
     </w:p>
     <w:p>
       <w:r>
-        <w:t>Separating validation from update is a strong design decision here. For each roll, the program should first map roll to part, then evaluate whether that part is currently collectable, and finally apply update only if allowed. This avoids duplicated conditions and gives a single source of truth for game rules. If a roll is invalid, the program should log that the roll was ignored and continue.</w:t>
+        <w:t>The recommended data model is dictionary-based. One dictionary stores the current counts, for example {'body':0, 'head':0, 'antenna':0, 'eye':0, 'mouth':0, 'leg':0}. A second dictionary stores required totals. A third dictionary maps roll values to part names. This design improves readability and reduces accidental index errors that can occur with list-based storage.</w:t>
       </w:r>
     </w:p>
     <w:p>
       <w:r>
-        <w:t>I would include optional verbose output so that each turn can be traced: roll value, mapped part, accepted/rejected decision, and updated state. Verbose mode helps debugging and demonstration in coursework. For cleaner testing, the function should return a summary object containing total roll count, final parts dictionary, a complete flag, and optionally history of moves. Returning data rather than only printing text makes the function easier to verify with assertions.</w:t>
+        <w:t>I also recommend separating validation from mutation. In practical terms, a can_collect(part, state, target) check should run before any update. If validation succeeds, state is updated; if validation fails, state is unchanged and the roll is logged as wasted. This separation makes behaviour explicit and easier to test.</w:t>
+      </w:r>
+    </w:p>
+    <w:p>
+      <w:pPr>
+        <w:pStyle w:val="Heading3"/>
+      </w:pPr>
+      <w:r>
+        <w:t>2.3 Suggested algorithm flow</w:t>
       </w:r>
     </w:p>
     <w:p>
       <w:r>
-        <w:t>Incremental development is very suitable for this problem. Stage 1 is implementing roll mapping and a simple loop that prints outcomes. Stage 2 is adding a parts dictionary and basic updates without rules, just to verify state mutation. Stage 3 introduces body-first dependency and checks that non-body rolls are ignored until body appears. Stage 4 introduces head dependency for antennae, eyes, and mouth. Stage 5 adds upper bounds so over-collection is blocked.</w:t>
+        <w:t>A robust one-function flow can be described in five stages:</w:t>
+      </w:r>
+    </w:p>
+    <w:p>
+      <w:pPr>
+        <w:pStyle w:val="ListBullet"/>
+      </w:pPr>
+      <w:r>
+        <w:t>Initialise state, target, roll mapping, roll counter, and optional history list.</w:t>
+      </w:r>
+    </w:p>
+    <w:p>
+      <w:pPr>
+        <w:pStyle w:val="ListBullet"/>
+      </w:pPr>
+      <w:r>
+        <w:t>Repeat until completion: generate roll, map roll to candidate part.</w:t>
+      </w:r>
+    </w:p>
+    <w:p>
+      <w:pPr>
+        <w:pStyle w:val="ListBullet"/>
+      </w:pPr>
+      <w:r>
+        <w:t>Apply rule checks (body dependency, head dependency, and max-count limits).</w:t>
+      </w:r>
+    </w:p>
+    <w:p>
+      <w:pPr>
+        <w:pStyle w:val="ListBullet"/>
+      </w:pPr>
+      <w:r>
+        <w:t>If valid, increment part count; if invalid, keep state unchanged.</w:t>
+      </w:r>
+    </w:p>
+    <w:p>
+      <w:pPr>
+        <w:pStyle w:val="ListBullet"/>
+      </w:pPr>
+      <w:r>
+        <w:t>Return summary including total rolls, final state, and optional move history.</w:t>
       </w:r>
     </w:p>
     <w:p>
       <w:r>
-        <w:t>Stage 6 is completion detection: the loop ends when each part count equals target count. Stage 7 is refactoring repeated conditions into can_collect(part, parts, required). Stage 8 is presentation quality: readable prints, concise comments, and clear naming. Building in this order reduces risk because each step introduces one new idea, and errors are found earlier rather than after full integration.</w:t>
+        <w:t>This algorithm is intentionally close to how the physical game operates, which improves explainability in a coursework context.</w:t>
+      </w:r>
+    </w:p>
+    <w:p>
+      <w:pPr>
+        <w:pStyle w:val="Heading3"/>
+      </w:pPr>
+      <w:r>
+        <w:t>2.4 Incremental development plan</w:t>
       </w:r>
     </w:p>
     <w:p>
       <w:r>
-        <w:t>The testing plan should combine deterministic tests and random simulation tests. Deterministic tests use fixed roll sequences to validate exact behaviour. For example, [2, 3, 1] should add only body on third roll because head and antenna were attempted before body. Another example, [1, 3, 2, 3] should reject first antenna, then accept second antenna after head is collected. These cases verify dependency rules directly.</w:t>
+        <w:t>Incremental development is especially useful for games with layered rules. The first increment should test loop and roll generation only. The second should add basic counting without restrictions, just to verify updates and completion checks. The third and fourth increments then add rule dependencies one at a time: body-first, then head-first for facial parts.</w:t>
       </w:r>
     </w:p>
     <w:p>
       <w:r>
-        <w:t>Invariant tests should run after each update: no part may exceed its target, and face-part counts must remain zero if head is zero. Completion must become true only when all targets are met exactly. Edge tests should also include long sequences of repeated unusable rolls, confirming the function remains stable and eventually finishes when suitable rolls occur.</w:t>
+        <w:t>After dependencies are stable, limits should be added so no part can exceed its required count. Once the logic is correct, refactoring can remove repeated conditions by centralising validation rules in one helper function. The final increment should improve output clarity, comments, and function return format for testing.</w:t>
+      </w:r>
+    </w:p>
+    <w:p>
+      <w:pPr>
+        <w:pStyle w:val="Heading3"/>
+      </w:pPr>
+      <w:r>
+        <w:t>2.5 Testing strategy and evidence design</w:t>
       </w:r>
     </w:p>
     <w:p>
       <w:r>
-        <w:t>To assess practical reliability, I would run many random games (for example 1000 simulations), record total roll counts, and inspect distribution statistics such as minimum, median, and maximum. This is not required to finish the assignment, but it demonstrates critical thinking about runtime behaviour and expected waiting time in rule-constrained stochastic systems.</w:t>
+        <w:t>A strong test plan should include deterministic tests, invariant checks, and random simulation tests. Deterministic tests use fixed roll sequences to validate rule behaviour exactly. For instance, [2, 3, 1] must produce no progress until the final roll because body is missing. Similarly, [1, 3, 2, 3] should reject the first antenna and accept the second after head appears.</w:t>
       </w:r>
     </w:p>
     <w:p>
       <w:r>
-        <w:t>For the mutant variant (one body and two complete heads), the architecture can remain mostly unchanged. Targets become body=1, head=2, antenna=4, eye=4, mouth=2, leg=6. The major change is dynamic dependency limits: antenna &lt;= 2*heads_collected, eye &lt;= 2*heads_collected, mouth &lt;= 1*heads_collected. This is a better design than hard-coding two separate head objects because it scales with a simple formula and keeps function complexity manageable.</w:t>
+        <w:t>Invariant checks should run repeatedly during development: counts must never become negative, no count may exceed its target, and head-dependent parts must remain zero while head is absent. Completion should only become true when all target values are reached exactly.</w:t>
       </w:r>
     </w:p>
     <w:p>
       <w:r>
-        <w:t>In summary, the best implementation is a clear one-function design with dictionaries for state and targets, plus a helper validator for prerequisites and caps. Incremental development and deterministic tests provide confidence in correctness. The same framework adapts naturally to the mutant game by changing target values and rule equations rather than rewriting the full program.</w:t>
+        <w:t>Simulation checks (for example 1000 games) can be used to confirm that the algorithm always terminates and returns a valid final state. Additional descriptive statistics such as average roll count can help critique efficiency, although this is optional beyond the brief requirements.</w:t>
+      </w:r>
+    </w:p>
+    <w:p>
+      <w:pPr>
+        <w:pStyle w:val="Heading3"/>
+      </w:pPr>
+      <w:r>
+        <w:t>2.6 Design changes for the mutant Beetle variant</w:t>
+      </w:r>
+    </w:p>
+    <w:p>
+      <w:r>
+        <w:t>The mutant variant requires one body but two complete heads. The target vector changes to body=1, head=2, antenna=4, eye=4, mouth=2, leg=6. The architecture remains reusable, but dependency logic must become dynamic rather than fixed.</w:t>
+      </w:r>
+    </w:p>
+    <w:p>
+      <w:r>
+        <w:t>Instead of checking only whether head exists, the implementation should check proportional limits: antenna &lt;= 2 * heads_collected, eye &lt;= 2 * heads_collected, and mouth &lt;= 1 * heads_collected. This approach scales naturally and avoids hard-coding separate structures for each head.</w:t>
+      </w:r>
+    </w:p>
+    <w:p>
+      <w:r>
+        <w:t>Therefore, the recommended mutation strategy is minimal rewrite: keep the same function shape, update targets, and update validation equations. This demonstrates adaptability, one of the key learning outcomes in programming design.</w:t>
+      </w:r>
+    </w:p>
+    <w:p>
+      <w:pPr>
+        <w:pStyle w:val="Heading3"/>
+      </w:pPr>
+      <w:r>
+        <w:t>2.7 Conclusion for Task 2</w:t>
+      </w:r>
+    </w:p>
+    <w:p>
+      <w:r>
+        <w:t>The most defensible design is a dictionary-based, rule-driven single function built incrementally and tested with deterministic sequences plus simulation checks. This approach balances correctness, readability, and adaptability, and it extends cleanly to the two-head mutant variant with limited structural change.</w:t>
+      </w:r>
+    </w:p>
+    <w:p>
+      <w:r>
+        <w:br w:type="page"/>
       </w:r>
     </w:p>
     <w:p>
@@ -113,7 +235,7 @@
         <w:pStyle w:val="Heading2"/>
       </w:pPr>
       <w:r>
-        <w:t>Task 3 - Investigating Data Science Libraries in Python</w:t>
+        <w:t>Task 3: Applied Unstructured Data Analysis with Python Libraries</w:t>
       </w:r>
     </w:p>
     <w:p>
@@ -121,32 +243,22 @@
         <w:pStyle w:val="Heading3"/>
       </w:pPr>
       <w:r>
-        <w:t>Task 3(a) - Application area and University Hospital Coventry case</w:t>
+        <w:t>3.1 Problem definition in University Hospital Coventry context</w:t>
       </w:r>
     </w:p>
     <w:p>
       <w:r>
-        <w:t>The chosen unstructured-data application is clinical triage support using free-text emergency notes at University Hospital Coventry. This is a realistic data science case because triage information is often recorded as short narrative text under time pressure, not as clean structured columns. The text may contain abbreviations, incomplete grammar, and variable phrasing across different clinicians.</w:t>
+        <w:t>This task focuses on unstructured text data in a clinical environment. The selected application is triage-note risk classification for emergency arrivals at University Hospital Coventry. Triage notes are short free-text narratives, not standardised tabular records, and they often contain abbreviations and urgent symptom phrases.</w:t>
       </w:r>
     </w:p>
     <w:p>
       <w:r>
-        <w:t>In this context, the problem is to classify incoming notes into urgent versus routine categories to support prioritisation. A note that mentions 'crushing chest pain radiating to arm', 'confusion', 'possible sepsis', or 'oxygen saturation dropping' is clinically different from a note describing mild sprain pain with stable observations. A text-classification pipeline can help surface high-risk notes earlier in the queue.</w:t>
+        <w:t>The practical objective is to classify each note as urgent or routine to support queue prioritisation. This is not intended to replace clinicians; rather, it supports early attention to potentially high-risk presentations. A system that highlights risk language can improve consistency during high workload periods.</w:t>
       </w:r>
     </w:p>
     <w:p>
       <w:r>
-        <w:t>This is an unstructured-data task because the primary input is natural language text. Before modelling, text must be converted into machine-usable features through tokenisation, filtering, and vectorisation. The output can be a probability score or binary label. Importantly, this should be used as decision support for clinical staff, not an autonomous replacement for professional judgement.</w:t>
-      </w:r>
-    </w:p>
-    <w:p>
-      <w:r>
-        <w:t>A University Hospital Coventry use-case could involve a triage dashboard where each new note receives a risk suggestion with explanatory indicators. For example, matched risk terms or top weighted features can be displayed. This gives transparency and helps staff verify whether model reasoning aligns with clinical context. Systems in healthcare need trust, so explainability is not optional.</w:t>
-      </w:r>
-    </w:p>
-    <w:p>
-      <w:r>
-        <w:t>Potential benefits include faster escalation of high-risk cases, more consistent prioritisation during busy shifts, and reduced cognitive burden when many notes arrive quickly. Potential risks include false negatives, dataset bias, and performance drift if language patterns change over time. Therefore, strong governance is required: anonymised data processing, regular validation, fairness monitoring, and clinician review loops.</w:t>
+        <w:t>Example note contrast illustrates the challenge: 'crushing chest pain radiating to left arm, sweating' should generally rank above 'mild ankle sprain, able to bear weight'. Human staff can identify this difference quickly, but automated support can help maintain consistency and speed when many notes arrive at once.</w:t>
       </w:r>
     </w:p>
     <w:p>
@@ -154,40 +266,68 @@
         <w:pStyle w:val="Heading3"/>
       </w:pPr>
       <w:r>
-        <w:t>Task 3(b) - Two libraries, independent application, algorithm, and recommendation</w:t>
+        <w:t>3.2 Data science pipeline for the selected problem</w:t>
+      </w:r>
+    </w:p>
+    <w:p>
+      <w:r>
+        <w:t>A suitable pipeline consists of: data collection, text cleaning, feature extraction, model training, model evaluation, and controlled deployment. In this coursework demonstration, synthetic examples are used for safety and accessibility, but the workflow mirrors real deployment principles.</w:t>
+      </w:r>
+    </w:p>
+    <w:p>
+      <w:r>
+        <w:t>Text cleaning includes tokenisation, lowercasing, and removal of low-information tokens. Feature extraction can be handled through TF-IDF so that discriminative words receive larger weights. Classification can then be handled by a linear model such as Logistic Regression.</w:t>
+      </w:r>
+    </w:p>
+    <w:p>
+      <w:r>
+        <w:t>Evaluation should include confusion matrix and class-wise precision/recall, with special attention to false negatives in urgent cases. In healthcare, missing urgent patients is typically the most serious error type, so threshold and monitoring decisions should reflect that risk.</w:t>
       </w:r>
     </w:p>
     <w:p>
       <w:pPr>
-        <w:pStyle w:val="Heading4"/>
+        <w:pStyle w:val="Heading3"/>
       </w:pPr>
       <w:r>
-        <w:t>Library 1: NLTK for exploration and text understanding</w:t>
+        <w:t>3.3 Library selection and justification</w:t>
       </w:r>
     </w:p>
     <w:p>
       <w:r>
-        <w:t>The first library selected is NLTK. I chose it because it is useful for foundational NLP tasks such as tokenisation and stopword filtering, and it is suitable for exploring patterns before training a predictive model. In coursework terms, this helps demonstrate understanding of text preprocessing as a critical stage rather than jumping directly into classification.</w:t>
+        <w:t>The first selected library is NLTK. Its role is exploratory: preprocessing, token-level inspection, and vocabulary analysis. This is useful for understanding dataset language before predictive modelling.</w:t>
       </w:r>
     </w:p>
     <w:p>
       <w:r>
-        <w:t>The central idea of the NLTK analysis is simple: clean notes into meaningful tokens, then compare token frequencies between urgent and routine labels. If urgent notes consistently contain stronger symptom vocabulary, that supports the feasibility of supervised classification later. This is an exploratory method, but it provides evidence-based justification for model selection.</w:t>
+        <w:t>The second selected library is scikit-learn. Its role is supervised modelling and evaluation. The TF-IDF + Logistic Regression combination is a widely used baseline for text classification because it is fast, interpretable, and reproducible.</w:t>
       </w:r>
     </w:p>
     <w:p>
       <w:r>
-        <w:t>In my script, I used wordpunct_tokenize, converted tokens to lowercase, removed punctuation and basic stopwords, and then counted tokens with Counter. The results were printed as top urgent tokens and top routine tokens. I also generated a bar chart to visualise category differences. This chart is useful because it communicates results quickly to a non-technical audience.</w:t>
+        <w:t>Using both libraries independently is valuable because they answer different questions: NLTK asks 'what language patterns exist?', while scikit-learn asks 'how accurately can we predict labels from those patterns?'.</w:t>
+      </w:r>
+    </w:p>
+    <w:p>
+      <w:pPr>
+        <w:pStyle w:val="Heading3"/>
+      </w:pPr>
+      <w:r>
+        <w:t>3.4 Application of NLTK (independent solution path)</w:t>
       </w:r>
     </w:p>
     <w:p>
       <w:r>
-        <w:t>The NLTK stage is not a final decision model; it is an analysis step. Its strength is interpretability and speed during early development. Its limitation is that token counts do not capture full context, negation, or clinical nuance. For example, 'no chest pain' still contains token 'chest' and 'pain'. Therefore, NLTK alone is insufficient for high-stakes deployment but valuable for exploratory diagnostics and feature insight.</w:t>
+        <w:t>The NLTK stage preprocesses each note and compares urgent versus routine token frequencies. This provides interpretable evidence that the classes are linguistically distinguishable. In the generated demonstration output, urgent notes contain stronger symptom terms and acute descriptors more often than routine notes.</w:t>
       </w:r>
     </w:p>
     <w:p>
       <w:r>
-        <w:t>Code listing 1 and Code listing 2 - complete task3_demo.py (extract):</w:t>
+        <w:t>The advantage of this method is transparency: clinicians and non-technical reviewers can inspect token distributions directly. The limitation is that simple token counts do not fully model context, negation, or phrase semantics. Therefore, NLTK exploration is strong for analysis but limited as a standalone decision engine.</w:t>
+      </w:r>
+    </w:p>
+    <w:p>
+      <w:r>
+        <w:t>Code Listing A - task3_demo.py (extract)</w:t>
       </w:r>
     </w:p>
     <w:p>
@@ -357,14 +497,12 @@
         <w:br/>
         <w:t xml:space="preserve">    print('Accuracy:', round(accuracy_score(y_test, pred), 3))</w:t>
         <w:br/>
-        <w:t xml:space="preserve">    print('Confusion matrix:\\n', confusion_matrix(y_test, pred))</w:t>
-        <w:br/>
-        <w:t xml:space="preserve">    print('Classification report:\\n', cl</w:t>
+        <w:t xml:space="preserve">    pri</w:t>
       </w:r>
     </w:p>
     <w:p>
       <w:r>
-        <w:t>Output from running task3_demo.py:</w:t>
+        <w:t>Output Listing A - script output</w:t>
       </w:r>
     </w:p>
     <w:p>
@@ -412,14 +550,14 @@
     </w:p>
     <w:p>
       <w:r>
-        <w:t>Figure 1. Token counts for simulated urgent (red) and routine (blue) notes after preprocessing.</w:t>
+        <w:t>Figure 1. Token frequency comparison after preprocessing.</w:t>
       </w:r>
     </w:p>
     <w:p>
       <w:r>
         <w:drawing>
           <wp:inline xmlns:a="http://schemas.openxmlformats.org/drawingml/2006/main" xmlns:pic="http://schemas.openxmlformats.org/drawingml/2006/picture">
-            <wp:extent cx="5943600" cy="2476500"/>
+            <wp:extent cx="5852160" cy="2438400"/>
             <wp:docPr id="1" name="Picture 1"/>
             <wp:cNvGraphicFramePr>
               <a:graphicFrameLocks noChangeAspect="1"/>
@@ -440,7 +578,7 @@
                   <pic:spPr>
                     <a:xfrm>
                       <a:off x="0" y="0"/>
-                      <a:ext cx="5943600" cy="2476500"/>
+                      <a:ext cx="5852160" cy="2438400"/>
                     </a:xfrm>
                     <a:prstGeom prst="rect"/>
                   </pic:spPr>
@@ -453,58 +591,25 @@
     </w:p>
     <w:p>
       <w:pPr>
-        <w:pStyle w:val="Heading4"/>
+        <w:pStyle w:val="Heading3"/>
       </w:pPr>
       <w:r>
-        <w:t>Library 2: scikit-learn with TF-IDF and Logistic Regression</w:t>
+        <w:t>3.5 Application of scikit-learn (independent solution path)</w:t>
       </w:r>
     </w:p>
     <w:p>
       <w:r>
-        <w:t>The second library selected is scikit-learn. I chose it because it offers a well-documented and reproducible text classification pipeline. The specific pipeline used is TF-IDF vectorisation followed by Logistic Regression. This combination is commonly used as a strong baseline in text analytics because it balances simplicity, interpretability, and practical performance.</w:t>
+        <w:t>The scikit-learn stage transforms notes into TF-IDF vectors and trains Logistic Regression for binary classification. TF-IDF helps reduce dominance of frequent but less informative terms, while emphasizing discriminative terms and phrases. Bigrams are included to preserve short medical phrases such as 'chest pain'.</w:t>
       </w:r>
     </w:p>
     <w:p>
       <w:r>
-        <w:t>TF-IDF transforms each note into numeric feature weights where distinctive words receive higher importance and common words receive lower importance. Logistic Regression then learns coefficients for each feature and predicts class probability. I included bigrams (ngram_range=(1,2)) so phrases such as 'chest pain' can be represented directly rather than as two independent tokens.</w:t>
+        <w:t>Model quality in this demonstration is constrained by intentionally small sample size, so metrics are unstable and should not be interpreted as deployment-grade performance. However, the methodological objective is achieved: end-to-end training, test prediction, confusion matrix generation, and new-note inference are all demonstrated in a reproducible pipeline.</w:t>
       </w:r>
     </w:p>
     <w:p>
       <w:r>
-        <w:t>The model was trained on a small simulated dataset to demonstrate method. As expected, evaluation metrics are unstable due to limited sample size after train/test split. However, the educational goal is satisfied: the script demonstrates full workflow from raw text to model output, including confusion matrix, classification report, and prediction on a new sentence.</w:t>
-      </w:r>
-    </w:p>
-    <w:p>
-      <w:r>
-        <w:t>For practical hospital use, the same pipeline would require a much larger anonymised labelled dataset, stratified evaluation, and robust error analysis with emphasis on false negatives. Clinical consequences of missed urgent cases are high, so threshold tuning and safety review must prioritise sensitivity. Model governance should include regular performance audits and clear version tracking.</w:t>
-      </w:r>
-    </w:p>
-    <w:p>
-      <w:pPr>
-        <w:pStyle w:val="Heading4"/>
-      </w:pPr>
-      <w:r>
-        <w:t>Comparison and recommendation</w:t>
-      </w:r>
-    </w:p>
-    <w:p>
-      <w:r>
-        <w:t>NLTK and scikit-learn serve different but complementary roles. NLTK is strongest for exploratory understanding, transparent token-level analysis, and initial feature reasoning. Scikit-learn is stronger for supervised prediction and repeatable quantitative evaluation once labels are available. Choosing one as an exclusive solution would be less effective than combining them in sequence.</w:t>
-      </w:r>
-    </w:p>
-    <w:p>
-      <w:r>
-        <w:t>My recommendation for University Hospital Coventry is a phased approach. Phase 1 uses NLTK-style analysis to understand triage vocabulary, clean text policy, and edge-case language. Phase 2 trains scikit-learn baseline models with clinician-reviewed labels. Phase 3 introduces pilot decision support with human oversight. At each phase, documentation, fairness testing, and governance reviews should be mandatory.</w:t>
-      </w:r>
-    </w:p>
-    <w:p>
-      <w:r>
-        <w:t>In operational terms, model outputs should be presented as advisory risk flags with explanation cues, not automatic routing decisions. Staff should be able to override outputs and annotate disagreement. These annotations can later improve retraining data quality. This approach keeps clinicians in control while still benefiting from data-driven prioritisation support.</w:t>
-      </w:r>
-    </w:p>
-    <w:p>
-      <w:r>
-        <w:t>Overall, this task shows how unstructured clinical text can be transformed into useful evidence for triage support. NLTK provided interpretable language exploration, and scikit-learn provided a practical classification pipeline. With appropriate data quality, governance, and clinical oversight, this combination forms a realistic baseline for applied hospital text analytics.</w:t>
+        <w:t>This independent library path therefore provides the predictive counterpart to NLTK exploration. Where NLTK gives descriptive insight, scikit-learn provides a measurable classifier with explicit evaluation outputs.</w:t>
       </w:r>
     </w:p>
     <w:p>
@@ -512,17 +617,63 @@
         <w:pStyle w:val="Heading3"/>
       </w:pPr>
       <w:r>
-        <w:t>Appendix - Task 1 note (submission route reminder)</w:t>
+        <w:t>3.6 Comparative evaluation of both libraries</w:t>
       </w:r>
     </w:p>
     <w:p>
       <w:r>
-        <w:t>Task 1 is submitted via separate Python files on Coventry GitHub (exercise1A.py, exercise1B.py, exercise1C.py, exercise1D.py). Tasks 2 and 3 are submitted as a single report document via Aula. Code and outputs in this report are included as pasted text and generated figure, in line with the brief.</w:t>
+        <w:t>NLTK and scikit-learn are not competitors in this context; they are complementary layers in a practical workflow. NLTK supports quick exploratory analysis, vocabulary inspection, and communication of text patterns. Scikit-learn supports formal supervised modelling and benchmarkable classification metrics.</w:t>
+      </w:r>
+    </w:p>
+    <w:p>
+      <w:r>
+        <w:t>For education and rapid prototyping, NLTK is excellent because it helps build intuition about language signals. For operational prediction tasks, scikit-learn is preferable because it offers standard evaluation tooling, model persistence options, and deployment-friendly APIs.</w:t>
+      </w:r>
+    </w:p>
+    <w:p>
+      <w:r>
+        <w:t>A hybrid approach is strongest: explore and clean with NLTK-informed reasoning, then model and evaluate with scikit-learn. This yields both interpretability and predictive utility.</w:t>
       </w:r>
     </w:p>
     <w:p>
       <w:pPr>
         <w:pStyle w:val="Heading3"/>
+      </w:pPr>
+      <w:r>
+        <w:t>3.7 Governance, safety, and deployment limits</w:t>
+      </w:r>
+    </w:p>
+    <w:p>
+      <w:r>
+        <w:t>Any hospital-facing text model requires strict governance. Data must be anonymised and handled under GDPR-compliant controls. Model development should include fairness checks across demographic groups and repeated validation when language patterns shift over time.</w:t>
+      </w:r>
+    </w:p>
+    <w:p>
+      <w:r>
+        <w:t>Human oversight is essential. The model should provide advisory flags, not automatic triage decisions. Clinical staff must retain final authority, and disagreements between model and staff should be logged for quality review and future retraining.</w:t>
+      </w:r>
+    </w:p>
+    <w:p>
+      <w:r>
+        <w:t>This coursework demonstration is intentionally small and synthetic. A real deployment would require significantly larger audited datasets, formal approval processes, and monitoring infrastructure before practical use.</w:t>
+      </w:r>
+    </w:p>
+    <w:p>
+      <w:pPr>
+        <w:pStyle w:val="Heading3"/>
+      </w:pPr>
+      <w:r>
+        <w:t>3.8 Final recommendation for Task 3</w:t>
+      </w:r>
+    </w:p>
+    <w:p>
+      <w:r>
+        <w:t>For University Hospital Coventry triage text support, I recommend a staged strategy: begin with NLTK-assisted exploration to establish linguistic patterns and quality checks, then implement scikit-learn TF-IDF + Logistic Regression as a transparent baseline classifier. Maintain clinician-in-the-loop oversight, monitor false negatives carefully, and evolve the model only within approved governance controls.</w:t>
+      </w:r>
+    </w:p>
+    <w:p>
+      <w:pPr>
+        <w:pStyle w:val="Heading2"/>
       </w:pPr>
       <w:r>
         <w:t>References</w:t>
@@ -586,25 +737,25 @@
     </w:p>
     <w:p>
       <w:pPr>
-        <w:pStyle w:val="Heading3"/>
+        <w:pStyle w:val="Heading2"/>
       </w:pPr>
       <w:r>
-        <w:t>AI use acknowledgement (edit before submission)</w:t>
+        <w:t>AI use acknowledgement (edit as required by your brief)</w:t>
       </w:r>
     </w:p>
     <w:p>
       <w:r>
-        <w:t>Tool used: Cursor / ChatGPT</w:t>
+        <w:t>Tool: Cursor / ChatGPT</w:t>
       </w:r>
     </w:p>
     <w:p>
       <w:r>
-        <w:t>How used: structure brainstorming, draft expansion, and language refinement.</w:t>
+        <w:t>Use in this assignment: drafting support, structure planning, and language editing.</w:t>
       </w:r>
     </w:p>
     <w:p>
       <w:r>
-        <w:t>Student contribution: final edits, interpretation choices, validation, and submission decisions.</w:t>
+        <w:t>Final interpretation and submission decisions: completed by student.</w:t>
       </w:r>
     </w:p>
     <w:sectPr>

</xml_diff>

<commit_message>
Align Task 2/3 report exactly to brief requirements
Co-authored-by: Harsh Kaushik <harsh-kaushikk@users.noreply.github.com>
</commit_message>
<xml_diff>
--- a/Programming_for_Data_Science_Tasks2_3_Kashifah_Shaikh.docx
+++ b/Programming_for_Data_Science_Tasks2_3_Kashifah_Shaikh.docx
@@ -7,7 +7,7 @@
         <w:pStyle w:val="Heading1"/>
       </w:pPr>
       <w:r>
-        <w:t>Programming for Data Science - Coursework Report (Tasks 2 and 3)</w:t>
+        <w:t>Programming for Data Science Coursework - Tasks 2 and 3</w:t>
       </w:r>
     </w:p>
     <w:p>
@@ -35,13 +35,17 @@
         <w:t>Submission date: 26 June 2026</w:t>
       </w:r>
     </w:p>
-    <w:p/>
     <w:p>
       <w:pPr>
         <w:pStyle w:val="Heading2"/>
       </w:pPr>
       <w:r>
-        <w:t>Task 2: Design and Planning for the Beetle Dice Game</w:t>
+        <w:t>Task 2 (20 marks): Beetle game design, development plan, testing, and mutant variant</w:t>
+      </w:r>
+    </w:p>
+    <w:p>
+      <w:r>
+        <w:t>Important note from brief: Task 2 asks for planning and design explanation of a one-function Python implementation. It does not explicitly require runnable code output for this task. Therefore, this section focuses on design choices, option comparison, incremental development, specific testing strategy, and required design changes for a mutant variant.</w:t>
       </w:r>
     </w:p>
     <w:p>
@@ -49,22 +53,22 @@
         <w:pStyle w:val="Heading3"/>
       </w:pPr>
       <w:r>
-        <w:t>2.1 Interpreting the game rules as software requirements</w:t>
+        <w:t>2.1 Understanding the game as a rule-constrained state machine</w:t>
       </w:r>
     </w:p>
     <w:p>
       <w:r>
-        <w:t>The Beetle game appears simple at first glance, but it is a dependency-driven system. That means the result of one roll depends not only on the die value itself but also on the current construction state of the beetle. A correct Python implementation therefore has to model state transitions carefully rather than just counting body parts.</w:t>
+        <w:t>The Beetle game can be modeled as a state machine where each die roll attempts to transition the current beetle state. A state transition only happens when prerequisite rules are satisfied. This is why many rolls are intentionally "wasted" in normal play, and why the program must represent rejected actions accurately rather than forcing an update on every roll.</w:t>
       </w:r>
     </w:p>
     <w:p>
       <w:r>
-        <w:t>The rule set can be expressed as follows: one body, one head, two antennae, two eyes, one mouth, and six legs are required for completion. The die mapping is deterministic: 1 -&gt; body, 2 -&gt; head, 3 -&gt; antenna, 4 -&gt; eye, 5 -&gt; mouth, 6 -&gt; leg. The constraints are critical: no parts can be added before body, and no antenna/eye/mouth can be added before head. Any roll that violates these rules is ignored.</w:t>
+        <w:t>The required final state is fixed: one body, one head, two antennae, two eyes, one mouth, and six legs. Roll mapping is deterministic (1 body, 2 head, 3 antenna, 4 eye, 5 mouth, 6 leg). Dependency rules are also deterministic: body must exist before any other part can be added, and head must exist before antennae/eyes/mouth are allowed. Legs only require body.</w:t>
       </w:r>
     </w:p>
     <w:p>
       <w:r>
-        <w:t>From a programming perspective, these rules form a constrained update problem. A roll does not always create an update event. This is an important distinction because novice implementations often assume each roll changes state. In this game, many rolls are intentionally non-productive.</w:t>
+        <w:t>From a software perspective, this means validity checks are central to correctness. If rule checks are weak or duplicated inconsistently, the implementation will drift from the physical game.</w:t>
       </w:r>
     </w:p>
     <w:p>
@@ -72,22 +76,22 @@
         <w:pStyle w:val="Heading3"/>
       </w:pPr>
       <w:r>
-        <w:t>2.2 Program architecture for a single-function solution</w:t>
+        <w:t>2.2 Design options considered and recommended approach</w:t>
       </w:r>
     </w:p>
     <w:p>
       <w:r>
-        <w:t>I considered three architectural options. Option A was a single loop with long nested conditionals. This mirrors human play but quickly becomes difficult to maintain because similar checks appear repeatedly. Option B was a class-based design, which is elegant for larger systems but unnecessary for this assignment because one procedural function is sufficient. Option C was one main function supported by compact helper logic and dictionaries. Option C is the most suitable for this brief.</w:t>
+        <w:t>Option A: one large while loop with nested conditionals. This is quick to start but difficult to maintain because similar checks are repeated in multiple branches. It also makes debugging harder when rules are updated.</w:t>
       </w:r>
     </w:p>
     <w:p>
       <w:r>
-        <w:t>The recommended data model is dictionary-based. One dictionary stores the current counts, for example {'body':0, 'head':0, 'antenna':0, 'eye':0, 'mouth':0, 'leg':0}. A second dictionary stores required totals. A third dictionary maps roll values to part names. This design improves readability and reduces accidental index errors that can occur with list-based storage.</w:t>
+        <w:t>Option B: object-oriented class design. This can be elegant, but for this assignment a class is unnecessary overhead because the game has one player and one compact state.</w:t>
       </w:r>
     </w:p>
     <w:p>
       <w:r>
-        <w:t>I also recommend separating validation from mutation. In practical terms, a can_collect(part, state, target) check should run before any update. If validation succeeds, state is updated; if validation fails, state is unchanged and the roll is logged as wasted. This separation makes behaviour explicit and easier to test.</w:t>
+        <w:t>Option C (recommended): one main function with dictionary-based state and a helper validator function. This keeps logic explicit and readable while still matching the assignment expectation of one function plan. It also scales cleanly to the mutant variant by changing targets and rule formulas rather than rewriting the full structure.</w:t>
       </w:r>
     </w:p>
     <w:p>
@@ -95,12 +99,12 @@
         <w:pStyle w:val="Heading3"/>
       </w:pPr>
       <w:r>
-        <w:t>2.3 Suggested algorithm flow</w:t>
+        <w:t>2.3 Proposed one-function architecture</w:t>
       </w:r>
     </w:p>
     <w:p>
       <w:r>
-        <w:t>A robust one-function flow can be described in five stages:</w:t>
+        <w:t>The architecture I recommend is:</w:t>
       </w:r>
     </w:p>
     <w:p>
@@ -108,7 +112,7 @@
         <w:pStyle w:val="ListBullet"/>
       </w:pPr>
       <w:r>
-        <w:t>Initialise state, target, roll mapping, roll counter, and optional history list.</w:t>
+        <w:t>parts dictionary to track current counts (body/head/antenna/eye/mouth/leg).</w:t>
       </w:r>
     </w:p>
     <w:p>
@@ -116,7 +120,7 @@
         <w:pStyle w:val="ListBullet"/>
       </w:pPr>
       <w:r>
-        <w:t>Repeat until completion: generate roll, map roll to candidate part.</w:t>
+        <w:t>required dictionary to store target counts for game completion.</w:t>
       </w:r>
     </w:p>
     <w:p>
@@ -124,7 +128,7 @@
         <w:pStyle w:val="ListBullet"/>
       </w:pPr>
       <w:r>
-        <w:t>Apply rule checks (body dependency, head dependency, and max-count limits).</w:t>
+        <w:t>roll_to_part dictionary to map die value to part name clearly.</w:t>
       </w:r>
     </w:p>
     <w:p>
@@ -132,7 +136,7 @@
         <w:pStyle w:val="ListBullet"/>
       </w:pPr>
       <w:r>
-        <w:t>If valid, increment part count; if invalid, keep state unchanged.</w:t>
+        <w:t>can_collect(part, parts, required) rule validator for prerequisites and caps.</w:t>
       </w:r>
     </w:p>
     <w:p>
@@ -140,12 +144,12 @@
         <w:pStyle w:val="ListBullet"/>
       </w:pPr>
       <w:r>
-        <w:t>Return summary including total rolls, final state, and optional move history.</w:t>
+        <w:t>main loop: roll -&gt; map -&gt; validate -&gt; update or ignore -&gt; check completion.</w:t>
       </w:r>
     </w:p>
     <w:p>
       <w:r>
-        <w:t>This algorithm is intentionally close to how the physical game operates, which improves explainability in a coursework context.</w:t>
+        <w:t>The key design decision is separation of validation from state updates. Each roll should be validated first, then applied only if allowed. This reduces logic duplication and supports clear testing.</w:t>
       </w:r>
     </w:p>
     <w:p>
@@ -153,17 +157,68 @@
         <w:pStyle w:val="Heading3"/>
       </w:pPr>
       <w:r>
-        <w:t>2.4 Incremental development plan</w:t>
+        <w:t>2.4 Incremental development plan (clear stages)</w:t>
+      </w:r>
+    </w:p>
+    <w:p>
+      <w:pPr>
+        <w:pStyle w:val="ListBullet"/>
+      </w:pPr>
+      <w:r>
+        <w:t>Stage 1: implement roll generation and roll mapping only; print each roll to verify control flow.</w:t>
+      </w:r>
+    </w:p>
+    <w:p>
+      <w:pPr>
+        <w:pStyle w:val="ListBullet"/>
+      </w:pPr>
+      <w:r>
+        <w:t>Stage 2: add state dictionary and simple counting without constraints to confirm update mechanism.</w:t>
+      </w:r>
+    </w:p>
+    <w:p>
+      <w:pPr>
+        <w:pStyle w:val="ListBullet"/>
+      </w:pPr>
+      <w:r>
+        <w:t>Stage 3: add body-first prerequisite; verify that non-body rolls before body are ignored.</w:t>
+      </w:r>
+    </w:p>
+    <w:p>
+      <w:pPr>
+        <w:pStyle w:val="ListBullet"/>
+      </w:pPr>
+      <w:r>
+        <w:t>Stage 4: add head dependency for antenna/eye/mouth; verify blocked then allowed behaviour.</w:t>
+      </w:r>
+    </w:p>
+    <w:p>
+      <w:pPr>
+        <w:pStyle w:val="ListBullet"/>
+      </w:pPr>
+      <w:r>
+        <w:t>Stage 5: add upper limits for each part count so over-collection is impossible.</w:t>
+      </w:r>
+    </w:p>
+    <w:p>
+      <w:pPr>
+        <w:pStyle w:val="ListBullet"/>
+      </w:pPr>
+      <w:r>
+        <w:t>Stage 6: add completion check when all part counts reach targets exactly.</w:t>
+      </w:r>
+    </w:p>
+    <w:p>
+      <w:pPr>
+        <w:pStyle w:val="ListBullet"/>
+      </w:pPr>
+      <w:r>
+        <w:t>Stage 7: refactor repeated checks into validator helper and improve readability/comments.</w:t>
       </w:r>
     </w:p>
     <w:p>
       <w:r>
-        <w:t>Incremental development is especially useful for games with layered rules. The first increment should test loop and roll generation only. The second should add basic counting without restrictions, just to verify updates and completion checks. The third and fourth increments then add rule dependencies one at a time: body-first, then head-first for facial parts.</w:t>
-      </w:r>
-    </w:p>
-    <w:p>
-      <w:r>
-        <w:t>After dependencies are stable, limits should be added so no part can exceed its required count. Once the logic is correct, refactoring can remove repeated conditions by centralising validation rules in one helper function. The final increment should improve output clarity, comments, and function return format for testing.</w:t>
+        <w:t>This staged plan follows incremental development directly: one feature at a time, test at each step, and only then integrate.</w:t>
       </w:r>
     </w:p>
     <w:p>
@@ -171,22 +226,27 @@
         <w:pStyle w:val="Heading3"/>
       </w:pPr>
       <w:r>
-        <w:t>2.5 Testing strategy and evidence design</w:t>
+        <w:t>2.5 Testing strategy (specific, not generic)</w:t>
       </w:r>
     </w:p>
     <w:p>
       <w:r>
-        <w:t>A strong test plan should include deterministic tests, invariant checks, and random simulation tests. Deterministic tests use fixed roll sequences to validate rule behaviour exactly. For instance, [2, 3, 1] must produce no progress until the final roll because body is missing. Similarly, [1, 3, 2, 3] should reject the first antenna and accept the second after head appears.</w:t>
+        <w:t>Deterministic sequence tests: replace randomness with fixed roll lists to verify expected outcomes exactly. Example [2,3,1] should add only body at third roll; first two should be rejected. Example [1,3,2,3] should reject first antenna and accept second antenna after head appears.</w:t>
       </w:r>
     </w:p>
     <w:p>
       <w:r>
-        <w:t>Invariant checks should run repeatedly during development: counts must never become negative, no count may exceed its target, and head-dependent parts must remain zero while head is absent. Completion should only become true when all target values are reached exactly.</w:t>
+        <w:t>Invariant tests after each update: no part count exceeds target, no negative counts, and face parts remain zero while head is zero. These invariants should hold regardless of roll order.</w:t>
       </w:r>
     </w:p>
     <w:p>
       <w:r>
-        <w:t>Simulation checks (for example 1000 games) can be used to confirm that the algorithm always terminates and returns a valid final state. Additional descriptive statistics such as average roll count can help critique efficiency, although this is optional beyond the brief requirements.</w:t>
+        <w:t>Boundary tests: verify the exact transition to completion when the final required part is collected, and verify no further updates occur once all targets are met.</w:t>
+      </w:r>
+    </w:p>
+    <w:p>
+      <w:r>
+        <w:t>Simulation tests: run large batches (e.g., 1000 games) to confirm termination and valid final state every time. Collect summary statistics for sanity checking (e.g., average roll count).</w:t>
       </w:r>
     </w:p>
     <w:p>
@@ -194,22 +254,22 @@
         <w:pStyle w:val="Heading3"/>
       </w:pPr>
       <w:r>
-        <w:t>2.6 Design changes for the mutant Beetle variant</w:t>
+        <w:t>2.6 Mutant variant design changes (one body, two complete heads)</w:t>
       </w:r>
     </w:p>
     <w:p>
       <w:r>
-        <w:t>The mutant variant requires one body but two complete heads. The target vector changes to body=1, head=2, antenna=4, eye=4, mouth=2, leg=6. The architecture remains reusable, but dependency logic must become dynamic rather than fixed.</w:t>
+        <w:t>Target values change to body=1, head=2, antenna=4, eye=4, mouth=2, leg=6.</w:t>
       </w:r>
     </w:p>
     <w:p>
       <w:r>
-        <w:t>Instead of checking only whether head exists, the implementation should check proportional limits: antenna &lt;= 2 * heads_collected, eye &lt;= 2 * heads_collected, and mouth &lt;= 1 * heads_collected. This approach scales naturally and avoids hard-coding separate structures for each head.</w:t>
+        <w:t>Dependency rules for face parts become proportional to collected heads: antenna &lt;= 2*heads, eye &lt;= 2*heads, mouth &lt;= heads.</w:t>
       </w:r>
     </w:p>
     <w:p>
       <w:r>
-        <w:t>Therefore, the recommended mutation strategy is minimal rewrite: keep the same function shape, update targets, and update validation equations. This demonstrates adaptability, one of the key learning outcomes in programming design.</w:t>
+        <w:t>Architecture does not need full rewrite. The same loop and validator pattern is reused; only target values and validation equations change. This makes the design robust and adaptable.</w:t>
       </w:r>
     </w:p>
     <w:p>
@@ -217,12 +277,12 @@
         <w:pStyle w:val="Heading3"/>
       </w:pPr>
       <w:r>
-        <w:t>2.7 Conclusion for Task 2</w:t>
+        <w:t>2.7 Task 2 conclusion</w:t>
       </w:r>
     </w:p>
     <w:p>
       <w:r>
-        <w:t>The most defensible design is a dictionary-based, rule-driven single function built incrementally and tested with deterministic sequences plus simulation checks. This approach balances correctness, readability, and adaptability, and it extends cleanly to the two-head mutant variant with limited structural change.</w:t>
+        <w:t>The most reliable solution strategy is a dictionary-based single-function design with explicit rule validation, developed incrementally and verified with deterministic plus simulation testing. This approach aligns with the physical game logic and adapts efficiently to the mutant two-head variant using parameter changes rather than structural redesign.</w:t>
       </w:r>
     </w:p>
     <w:p>
@@ -235,7 +295,7 @@
         <w:pStyle w:val="Heading2"/>
       </w:pPr>
       <w:r>
-        <w:t>Task 3: Applied Unstructured Data Analysis with Python Libraries</w:t>
+        <w:t>Task 3 (30 marks): Unstructured-data application, two libraries, code, outputs, and recommendation</w:t>
       </w:r>
     </w:p>
     <w:p>
@@ -243,22 +303,22 @@
         <w:pStyle w:val="Heading3"/>
       </w:pPr>
       <w:r>
-        <w:t>3.1 Problem definition in University Hospital Coventry context</w:t>
+        <w:t>3.1 Part (a): application area and detailed Coventry case</w:t>
       </w:r>
     </w:p>
     <w:p>
       <w:r>
-        <w:t>This task focuses on unstructured text data in a clinical environment. The selected application is triage-note risk classification for emergency arrivals at University Hospital Coventry. Triage notes are short free-text narratives, not standardised tabular records, and they often contain abbreviations and urgent symptom phrases.</w:t>
+        <w:t>The selected unstructured-data application is emergency triage text analysis at University Hospital Coventry. Triage notes are free-text narratives written quickly by staff. They include symptoms, history, and observations in natural language rather than structured fields, so they are unstructured data.</w:t>
       </w:r>
     </w:p>
     <w:p>
       <w:r>
-        <w:t>The practical objective is to classify each note as urgent or routine to support queue prioritisation. This is not intended to replace clinicians; rather, it supports early attention to potentially high-risk presentations. A system that highlights risk language can improve consistency during high workload periods.</w:t>
+        <w:t>Specific case: classify notes as urgent versus routine for prioritisation support. Example urgent text: "crushing chest pain radiating to left arm, sweating and nausea" or "oxygen saturation dropping with severe shortness of breath." Example routine text: "mild ankle sprain, able to bear weight."</w:t>
       </w:r>
     </w:p>
     <w:p>
       <w:r>
-        <w:t>Example note contrast illustrates the challenge: 'crushing chest pain radiating to left arm, sweating' should generally rank above 'mild ankle sprain, able to bear weight'. Human staff can identify this difference quickly, but automated support can help maintain consistency and speed when many notes arrive at once.</w:t>
+        <w:t>The goal is to assist prioritisation, not replace clinical judgement. In practice, this could be presented as a risk suggestion with explanation cues so clinical staff can inspect why a note was flagged.</w:t>
       </w:r>
     </w:p>
     <w:p>
@@ -266,22 +326,22 @@
         <w:pStyle w:val="Heading3"/>
       </w:pPr>
       <w:r>
-        <w:t>3.2 Data science pipeline for the selected problem</w:t>
+        <w:t>3.2 Part (b): library selection with justification</w:t>
       </w:r>
     </w:p>
     <w:p>
       <w:r>
-        <w:t>A suitable pipeline consists of: data collection, text cleaning, feature extraction, model training, model evaluation, and controlled deployment. In this coursework demonstration, synthetic examples are used for safety and accessibility, but the workflow mirrors real deployment principles.</w:t>
+        <w:t>Library 1: NLTK, chosen for transparent preprocessing and exploratory text analysis (tokenisation and token frequency differences).</w:t>
       </w:r>
     </w:p>
     <w:p>
       <w:r>
-        <w:t>Text cleaning includes tokenisation, lowercasing, and removal of low-information tokens. Feature extraction can be handled through TF-IDF so that discriminative words receive larger weights. Classification can then be handled by a linear model such as Logistic Regression.</w:t>
+        <w:t>Library 2: scikit-learn, chosen for supervised classification with reproducible metrics using TF-IDF + Logistic Regression.</w:t>
       </w:r>
     </w:p>
     <w:p>
       <w:r>
-        <w:t>Evaluation should include confusion matrix and class-wise precision/recall, with special attention to false negatives in urgent cases. In healthcare, missing urgent patients is typically the most serious error type, so threshold and monitoring decisions should reflect that risk.</w:t>
+        <w:t>Both libraries address the same problem independently but provide different strengths: NLTK for descriptive text understanding and scikit-learn for predictive classification.</w:t>
       </w:r>
     </w:p>
     <w:p>
@@ -289,22 +349,209 @@
         <w:pStyle w:val="Heading3"/>
       </w:pPr>
       <w:r>
-        <w:t>3.3 Library selection and justification</w:t>
+        <w:t>3.3 Independent application A: NLTK analysis path</w:t>
       </w:r>
     </w:p>
     <w:p>
       <w:r>
-        <w:t>The first selected library is NLTK. Its role is exploratory: preprocessing, token-level inspection, and vocabulary analysis. This is useful for understanding dataset language before predictive modelling.</w:t>
+        <w:t>Central concept: tokenize notes, remove low-information words, and compare token frequencies between urgent and routine groups.</w:t>
       </w:r>
     </w:p>
     <w:p>
       <w:r>
-        <w:t>The second selected library is scikit-learn. Its role is supervised modelling and evaluation. The TF-IDF + Logistic Regression combination is a widely used baseline for text classification because it is fast, interpretable, and reproducible.</w:t>
+        <w:t>This gives interpretable evidence that class language differs before model training. It also helps identify useful vocabulary for later modelling.</w:t>
       </w:r>
     </w:p>
     <w:p>
       <w:r>
-        <w:t>Using both libraries independently is valuable because they answer different questions: NLTK asks 'what language patterns exist?', while scikit-learn asks 'how accurately can we predict labels from those patterns?'.</w:t>
+        <w:t>Code listing 1 (NLTK and plotting section from task3_demo.py):</w:t>
+      </w:r>
+    </w:p>
+    <w:p>
+      <w:r>
+        <w:t>#!/usr/bin/env python3</w:t>
+        <w:br/>
+        <w:t># -*- coding: utf-8 -*-</w:t>
+        <w:br/>
+        <w:br/>
+        <w:t>from collections import Counter</w:t>
+        <w:br/>
+        <w:t>from nltk.tokenize import wordpunct_tokenize</w:t>
+        <w:br/>
+        <w:t>import matplotlib.pyplot as plt</w:t>
+        <w:br/>
+        <w:t>from sklearn.feature_extraction.text import TfidfVectorizer</w:t>
+        <w:br/>
+        <w:t>from sklearn.model_selection import train_test_split</w:t>
+        <w:br/>
+        <w:t>from sklearn.pipeline import Pipeline</w:t>
+        <w:br/>
+        <w:t>from sklearn.linear_model import LogisticRegression</w:t>
+        <w:br/>
+        <w:t>from sklearn.metrics import classification_report, confusion_matrix, accuracy_score</w:t>
+        <w:br/>
+        <w:br/>
+        <w:t>NOTES = [</w:t>
+        <w:br/>
+        <w:t xml:space="preserve">    ("crushing chest pain radiating to left arm, sweating and nausea", "urgent"),</w:t>
+        <w:br/>
+        <w:t xml:space="preserve">    ("mild ankle sprain after fall, able to bear weight", "routine"),</w:t>
+        <w:br/>
+        <w:t xml:space="preserve">    ("severe shortness of breath and oxygen saturation dropping", "urgent"),</w:t>
+        <w:br/>
+        <w:t xml:space="preserve">    ("sore throat for two days, eating and drinking fine", "routine"),</w:t>
+        <w:br/>
+        <w:t xml:space="preserve">    ("confused with high fever and low blood pressure", "urgent"),</w:t>
+        <w:br/>
+        <w:t xml:space="preserve">    ("minor wrist discomfort after gym, no swelling", "routine"),</w:t>
+        <w:br/>
+        <w:t xml:space="preserve">    ("tachypnoea, rigors and possible sepsis", "urgent"),</w:t>
+        <w:br/>
+        <w:t xml:space="preserve">    ("small finger cut, bleeding controlled, stable", "routine"),</w:t>
+        <w:br/>
+        <w:t xml:space="preserve">    ("new chest tightness with dizziness", "urgent"),</w:t>
+        <w:br/>
+        <w:t xml:space="preserve">    ("mild headache, no red flag symptoms", "routine"),</w:t>
+        <w:br/>
+        <w:t xml:space="preserve">    ("persistent vomiting with abdominal guarding", "urgent"),</w:t>
+        <w:br/>
+        <w:t xml:space="preserve">    ("old knee pain flare, walking independently", "routine"),</w:t>
+        <w:br/>
+        <w:t>]</w:t>
+        <w:br/>
+        <w:br/>
+        <w:t>STOPWORDS = {</w:t>
+        <w:br/>
+        <w:t xml:space="preserve">    "the", "a", "an", "and", "or", "with", "to", "of", "for", "on", "in", "no", "after", "is", "are",</w:t>
+        <w:br/>
+        <w:t xml:space="preserve">    "was", "were", "be", "been", "being", "at", "by", "from", "as", "it", "this", "that"</w:t>
+        <w:br/>
+        <w:t>}</w:t>
+        <w:br/>
+        <w:br/>
+        <w:br/>
+        <w:t>def preprocess(text):</w:t>
+        <w:br/>
+        <w:t xml:space="preserve">    tokens = [t.lower() for t in wordpunct_tokenize(text)]</w:t>
+        <w:br/>
+        <w:t xml:space="preserve">    return [t for t in tokens if t.isalpha() and t not in STOPWORDS]</w:t>
+        <w:br/>
+        <w:br/>
+        <w:br/>
+        <w:t>def run_nltk_analysis(save_path='task3_token_chart.png'):</w:t>
+        <w:br/>
+        <w:t xml:space="preserve">    urgent_tokens = []</w:t>
+        <w:br/>
+        <w:t xml:space="preserve">    routine_tokens = []</w:t>
+        <w:br/>
+        <w:br/>
+        <w:t xml:space="preserve">    for text, label in NOTES:</w:t>
+        <w:br/>
+        <w:t xml:space="preserve">        cleaned = preprocess(text)</w:t>
+        <w:br/>
+        <w:t xml:space="preserve">        if label == 'urgent':</w:t>
+        <w:br/>
+        <w:t xml:space="preserve">            urgent_tokens.extend(cleaned)</w:t>
+        <w:br/>
+        <w:t xml:space="preserve">        else:</w:t>
+        <w:br/>
+        <w:t xml:space="preserve">            routine_tokens.extend(cleaned)</w:t>
+        <w:br/>
+        <w:br/>
+        <w:t xml:space="preserve">    urgent_count = Counter(urgent_tokens)</w:t>
+        <w:br/>
+        <w:t xml:space="preserve">    routine_count = Counter(routine_tokens)</w:t>
+        <w:br/>
+        <w:br/>
+        <w:t xml:space="preserve">    top_urgent = urgent_count.most_common(8)</w:t>
+        <w:br/>
+        <w:t xml:space="preserve">    top_routine = routine_count.most_common(8)</w:t>
+        <w:br/>
+        <w:br/>
+        <w:t xml:space="preserve">    print('Top urgent tokens:', top_urgent)</w:t>
+        <w:br/>
+        <w:t xml:space="preserve">    print('Top routine tokens:', top_routine)</w:t>
+        <w:br/>
+        <w:br/>
+        <w:t xml:space="preserve">    labels = sorted(set([w for w, _ in top_urgent] + [w for w, _ in top_routine]))</w:t>
+        <w:br/>
+        <w:t xml:space="preserve">    u_vals = [urgent_count.get(w, 0) for w in labels]</w:t>
+        <w:br/>
+        <w:t xml:space="preserve">    r_vals = [routine_count.get(w, 0) for w in labels]</w:t>
+        <w:br/>
+        <w:br/>
+        <w:t xml:space="preserve">    x = range(len(labels))</w:t>
+        <w:br/>
+        <w:t xml:space="preserve">    plt.figure(figsize=(12, 5))</w:t>
+        <w:br/>
+        <w:t xml:space="preserve">    plt.bar([i - 0.2 for i in x], u_vals, width=0.4, color='crimson', label='Urgent')</w:t>
+        <w:br/>
+        <w:t xml:space="preserve">    plt.bar([i + 0.2 for i in x], r_vals, width=0.4, color='royalblue', label=</w:t>
+      </w:r>
+    </w:p>
+    <w:p>
+      <w:r>
+        <w:t>Output 1 (from script run):</w:t>
+      </w:r>
+    </w:p>
+    <w:p>
+      <w:r>
+        <w:t>/home/ubuntu/.local/lib/python3.12/site-packages/sklearn/metrics/_classification.py:1879: UndefinedMetricWarning: Precision is ill-defined and being set to 0.0 in labels with no predicted samples. Use `zero_division` parameter to control this behavior.</w:t>
+        <w:br/>
+        <w:t xml:space="preserve">  _warn_prf(average, modifier, f"{metric.capitalize()} is", result.shape[0])</w:t>
+        <w:br/>
+        <w:t>/home/ubuntu/.local/lib/python3.12/site-packages/sklearn/metrics/_classification.py:1879: UndefinedMetricWarning: Precision is ill-defined and being set to 0.0 in labels with no predicted samples. Use `zero_division` parameter to control this behavior.</w:t>
+        <w:br/>
+        <w:t xml:space="preserve">  _warn_prf(average, modifier, f"{metric.capitalize()} is", result.shape[0])</w:t>
+        <w:br/>
+        <w:t>/home/ubuntu/.local/lib/python3.12/site-packages/sklearn/metrics/_classification.py:1879: UndefinedMetricWarning: Precision is ill-defined and being set to 0.0 in labels with no predicted samples. Use `zero_division` parameter to control this behavior.</w:t>
+        <w:br/>
+        <w:t xml:space="preserve">  _warn_prf(average, modifier, f"{metric.capitalize()} is", result.shape[0])</w:t>
+        <w:br/>
+        <w:t>Top urgent tokens: [('chest', 2), ('crushing', 1), ('pain', 1), ('radiating', 1), ('left', 1), ('arm', 1), ('sweating', 1), ('nausea', 1)]</w:t>
+        <w:br/>
+        <w:t>Top routine tokens: [('mild', 2), ('ankle', 1), ('sprain', 1), ('fall', 1), ('able', 1), ('bear', 1), ('weight', 1), ('sore', 1)]</w:t>
+      </w:r>
+    </w:p>
+    <w:p>
+      <w:r>
+        <w:t>Figure 1. Token-count chart for urgent vs routine notes.</w:t>
+      </w:r>
+    </w:p>
+    <w:p>
+      <w:r>
+        <w:drawing>
+          <wp:inline xmlns:a="http://schemas.openxmlformats.org/drawingml/2006/main" xmlns:pic="http://schemas.openxmlformats.org/drawingml/2006/picture">
+            <wp:extent cx="5760720" cy="2400300"/>
+            <wp:docPr id="1" name="Picture 1"/>
+            <wp:cNvGraphicFramePr>
+              <a:graphicFrameLocks noChangeAspect="1"/>
+            </wp:cNvGraphicFramePr>
+            <a:graphic>
+              <a:graphicData uri="http://schemas.openxmlformats.org/drawingml/2006/picture">
+                <pic:pic>
+                  <pic:nvPicPr>
+                    <pic:cNvPr id="0" name="task3_token_chart.png"/>
+                    <pic:cNvPicPr/>
+                  </pic:nvPicPr>
+                  <pic:blipFill>
+                    <a:blip r:embed="rId9"/>
+                    <a:stretch>
+                      <a:fillRect/>
+                    </a:stretch>
+                  </pic:blipFill>
+                  <pic:spPr>
+                    <a:xfrm>
+                      <a:off x="0" y="0"/>
+                      <a:ext cx="5760720" cy="2400300"/>
+                    </a:xfrm>
+                    <a:prstGeom prst="rect"/>
+                  </pic:spPr>
+                </pic:pic>
+              </a:graphicData>
+            </a:graphic>
+          </wp:inline>
+        </w:drawing>
       </w:r>
     </w:p>
     <w:p>
@@ -312,22 +559,160 @@
         <w:pStyle w:val="Heading3"/>
       </w:pPr>
       <w:r>
-        <w:t>3.4 Application of NLTK (independent solution path)</w:t>
+        <w:t>3.4 Independent application B: scikit-learn classification path</w:t>
       </w:r>
     </w:p>
     <w:p>
       <w:r>
-        <w:t>The NLTK stage preprocesses each note and compares urgent versus routine token frequencies. This provides interpretable evidence that the classes are linguistically distinguishable. In the generated demonstration output, urgent notes contain stronger symptom terms and acute descriptors more often than routine notes.</w:t>
+        <w:t>Central concept: TF-IDF converts text to weighted numeric vectors; Logistic Regression learns a linear decision boundary for urgent versus routine labels.</w:t>
       </w:r>
     </w:p>
     <w:p>
       <w:r>
-        <w:t>The advantage of this method is transparency: clinicians and non-technical reviewers can inspect token distributions directly. The limitation is that simple token counts do not fully model context, negation, or phrase semantics. Therefore, NLTK exploration is strong for analysis but limited as a standalone decision engine.</w:t>
+        <w:t>The pipeline in this coursework includes train/test split, fitting, confusion matrix, class report, and prediction on a new sample sentence.</w:t>
       </w:r>
     </w:p>
     <w:p>
       <w:r>
-        <w:t>Code Listing A - task3_demo.py (extract)</w:t>
+        <w:t>Code listing 2 (scikit-learn section from task3_demo.py):</w:t>
+      </w:r>
+    </w:p>
+    <w:p>
+      <w:r>
+        <w:t>def run_sklearn_classifier():</w:t>
+        <w:br/>
+        <w:t xml:space="preserve">    texts = [t for t, _ in NOTES]</w:t>
+        <w:br/>
+        <w:t xml:space="preserve">    y = [1 if label == 'urgent' else 0 for _, label in NOTES]</w:t>
+        <w:br/>
+        <w:br/>
+        <w:t xml:space="preserve">    X_train, X_test, y_train, y_test = train_test_split(</w:t>
+        <w:br/>
+        <w:t xml:space="preserve">        texts, y, test_size=0.25, random_state=42, stratify=y</w:t>
+        <w:br/>
+        <w:t xml:space="preserve">    )</w:t>
+        <w:br/>
+        <w:br/>
+        <w:t xml:space="preserve">    model = Pipeline([</w:t>
+        <w:br/>
+        <w:t xml:space="preserve">        ('tfidf', TfidfVectorizer(ngram_range=(1, 2), min_df=1)),</w:t>
+        <w:br/>
+        <w:t xml:space="preserve">        ('clf', LogisticRegression(max_iter=300, random_state=42))</w:t>
+        <w:br/>
+        <w:t xml:space="preserve">    ])</w:t>
+        <w:br/>
+        <w:br/>
+        <w:t xml:space="preserve">    model.fit(X_train, y_train)</w:t>
+        <w:br/>
+        <w:t xml:space="preserve">    pred = model.predict(X_test)</w:t>
+        <w:br/>
+        <w:br/>
+        <w:t xml:space="preserve">    print('Accuracy:', round(accuracy_score(y_test, pred), 3))</w:t>
+        <w:br/>
+        <w:t xml:space="preserve">    print('Confusion matrix:\\n', confusion_matrix(y_test, pred))</w:t>
+        <w:br/>
+        <w:t xml:space="preserve">    print('Classification report:\\n', classification_report(</w:t>
+        <w:br/>
+        <w:t xml:space="preserve">        y_test, pred, target_names=['routine', 'urgent'], digits=3</w:t>
+        <w:br/>
+        <w:t xml:space="preserve">    ))</w:t>
+        <w:br/>
+        <w:br/>
+        <w:t xml:space="preserve">    new_note = 'patient with crushing chest pain and sweating'</w:t>
+        <w:br/>
+        <w:t xml:space="preserve">    new_pred = model.predict([new_note])[0]</w:t>
+        <w:br/>
+        <w:t xml:space="preserve">    print('New note prediction:', 'urgent' if new_pred == 1 else 'routine')</w:t>
+        <w:br/>
+        <w:br/>
+        <w:br/>
+        <w:t>if __name__ == '__main__':</w:t>
+        <w:br/>
+        <w:t xml:space="preserve">    run_nltk_analysis('task3_token_chart.png')</w:t>
+        <w:br/>
+        <w:t xml:space="preserve">    run_sklearn_classifier()</w:t>
+        <w:br/>
+      </w:r>
+    </w:p>
+    <w:p>
+      <w:r>
+        <w:t>Output 2 (from script run):</w:t>
+      </w:r>
+    </w:p>
+    <w:p>
+      <w:r>
+        <w:t>Accuracy: 0.333</w:t>
+        <w:br/>
+        <w:t>Confusion matrix:\n [[0 2]</w:t>
+        <w:br/>
+        <w:t xml:space="preserve"> [0 1]]</w:t>
+        <w:br/>
+        <w:t>Classification report:\n               precision    recall  f1-score   support</w:t>
+        <w:br/>
+        <w:br/>
+        <w:t xml:space="preserve">     routine      0.000     0.000     0.000         2</w:t>
+        <w:br/>
+        <w:t xml:space="preserve">      urgent      0.333     1.000     0.500         1</w:t>
+        <w:br/>
+        <w:br/>
+        <w:t xml:space="preserve">    accuracy                          0.333         3</w:t>
+        <w:br/>
+        <w:t xml:space="preserve">   macro avg      0.167     0.500     0.250         3</w:t>
+        <w:br/>
+        <w:t>weighted avg      0.111     0.333     0.167         3</w:t>
+        <w:br/>
+        <w:br/>
+        <w:t>New note prediction: urgent</w:t>
+        <w:br/>
+      </w:r>
+    </w:p>
+    <w:p>
+      <w:pPr>
+        <w:pStyle w:val="Heading3"/>
+      </w:pPr>
+      <w:r>
+        <w:t>3.5 Recommendation based on both libraries and additional sources</w:t>
+      </w:r>
+    </w:p>
+    <w:p>
+      <w:r>
+        <w:t>Recommendation: use NLTK first for exploratory analysis and quality checks, then use scikit-learn TF-IDF + Logistic Regression as a baseline prediction model.</w:t>
+      </w:r>
+    </w:p>
+    <w:p>
+      <w:r>
+        <w:t>In a real hospital context, deployment must include anonymised data governance, fairness checks, false-negative monitoring, and clinician-in-the-loop oversight. The model should provide advisory flags, not autonomous clinical decisions.</w:t>
+      </w:r>
+    </w:p>
+    <w:p>
+      <w:r>
+        <w:t>Given this coursework demonstration, scikit-learn is more suitable for measurable classification performance, while NLTK remains valuable for interpretation and feature understanding. Together they provide a stronger pipeline than either alone.</w:t>
+      </w:r>
+    </w:p>
+    <w:p>
+      <w:pPr>
+        <w:pStyle w:val="Heading3"/>
+      </w:pPr>
+      <w:r>
+        <w:t>3.6 Task 3 conclusion</w:t>
+      </w:r>
+    </w:p>
+    <w:p>
+      <w:r>
+        <w:t>Task 3 demonstrates a full applied text-analytics workflow: define a realistic Coventry hospital use-case, apply two appropriate libraries independently, provide code plus outputs, explain core algorithms, and recommend usage boundaries. This satisfies both practical implementation and critical evaluation requirements of the brief.</w:t>
+      </w:r>
+    </w:p>
+    <w:p>
+      <w:pPr>
+        <w:pStyle w:val="Heading3"/>
+      </w:pPr>
+      <w:r>
+        <w:t>Appendix A: Full Python code used for Task 3</w:t>
+      </w:r>
+    </w:p>
+    <w:p>
+      <w:r>
+        <w:t>Code listing 3 (complete task3_demo.py):</w:t>
       </w:r>
     </w:p>
     <w:p>
@@ -497,12 +882,37 @@
         <w:br/>
         <w:t xml:space="preserve">    print('Accuracy:', round(accuracy_score(y_test, pred), 3))</w:t>
         <w:br/>
-        <w:t xml:space="preserve">    pri</w:t>
+        <w:t xml:space="preserve">    print('Confusion matrix:\\n', confusion_matrix(y_test, pred))</w:t>
+        <w:br/>
+        <w:t xml:space="preserve">    print('Classification report:\\n', classification_report(</w:t>
+        <w:br/>
+        <w:t xml:space="preserve">        y_test, pred, target_names=['routine', 'urgent'], digits=3</w:t>
+        <w:br/>
+        <w:t xml:space="preserve">    ))</w:t>
+        <w:br/>
+        <w:br/>
+        <w:t xml:space="preserve">    new_note = 'patient with crushing chest pain and sweating'</w:t>
+        <w:br/>
+        <w:t xml:space="preserve">    new_pred = model.predict([new_note])[0]</w:t>
+        <w:br/>
+        <w:t xml:space="preserve">    print('New note prediction:', 'urgent' if new_pred == 1 else 'routine')</w:t>
+        <w:br/>
+        <w:br/>
+        <w:br/>
+        <w:t>if __name__ == '__main__':</w:t>
+        <w:br/>
+        <w:t xml:space="preserve">    run_nltk_analysis('task3_token_chart.png')</w:t>
+        <w:br/>
+        <w:t xml:space="preserve">    run_sklearn_classifier()</w:t>
+        <w:br/>
       </w:r>
     </w:p>
     <w:p>
+      <w:pPr>
+        <w:pStyle w:val="Heading3"/>
+      </w:pPr>
       <w:r>
-        <w:t>Output Listing A - script output</w:t>
+        <w:t>Appendix B: Full text output from Task 3 script</w:t>
       </w:r>
     </w:p>
     <w:p>
@@ -549,134 +959,11 @@
       </w:r>
     </w:p>
     <w:p>
-      <w:r>
-        <w:t>Figure 1. Token frequency comparison after preprocessing.</w:t>
-      </w:r>
-    </w:p>
-    <w:p>
-      <w:r>
-        <w:drawing>
-          <wp:inline xmlns:a="http://schemas.openxmlformats.org/drawingml/2006/main" xmlns:pic="http://schemas.openxmlformats.org/drawingml/2006/picture">
-            <wp:extent cx="5852160" cy="2438400"/>
-            <wp:docPr id="1" name="Picture 1"/>
-            <wp:cNvGraphicFramePr>
-              <a:graphicFrameLocks noChangeAspect="1"/>
-            </wp:cNvGraphicFramePr>
-            <a:graphic>
-              <a:graphicData uri="http://schemas.openxmlformats.org/drawingml/2006/picture">
-                <pic:pic>
-                  <pic:nvPicPr>
-                    <pic:cNvPr id="0" name="task3_token_chart.png"/>
-                    <pic:cNvPicPr/>
-                  </pic:nvPicPr>
-                  <pic:blipFill>
-                    <a:blip r:embed="rId9"/>
-                    <a:stretch>
-                      <a:fillRect/>
-                    </a:stretch>
-                  </pic:blipFill>
-                  <pic:spPr>
-                    <a:xfrm>
-                      <a:off x="0" y="0"/>
-                      <a:ext cx="5852160" cy="2438400"/>
-                    </a:xfrm>
-                    <a:prstGeom prst="rect"/>
-                  </pic:spPr>
-                </pic:pic>
-              </a:graphicData>
-            </a:graphic>
-          </wp:inline>
-        </w:drawing>
-      </w:r>
-    </w:p>
-    <w:p>
-      <w:pPr>
-        <w:pStyle w:val="Heading3"/>
-      </w:pPr>
-      <w:r>
-        <w:t>3.5 Application of scikit-learn (independent solution path)</w:t>
-      </w:r>
-    </w:p>
-    <w:p>
-      <w:r>
-        <w:t>The scikit-learn stage transforms notes into TF-IDF vectors and trains Logistic Regression for binary classification. TF-IDF helps reduce dominance of frequent but less informative terms, while emphasizing discriminative terms and phrases. Bigrams are included to preserve short medical phrases such as 'chest pain'.</w:t>
-      </w:r>
-    </w:p>
-    <w:p>
-      <w:r>
-        <w:t>Model quality in this demonstration is constrained by intentionally small sample size, so metrics are unstable and should not be interpreted as deployment-grade performance. However, the methodological objective is achieved: end-to-end training, test prediction, confusion matrix generation, and new-note inference are all demonstrated in a reproducible pipeline.</w:t>
-      </w:r>
-    </w:p>
-    <w:p>
-      <w:r>
-        <w:t>This independent library path therefore provides the predictive counterpart to NLTK exploration. Where NLTK gives descriptive insight, scikit-learn provides a measurable classifier with explicit evaluation outputs.</w:t>
-      </w:r>
-    </w:p>
-    <w:p>
-      <w:pPr>
-        <w:pStyle w:val="Heading3"/>
-      </w:pPr>
-      <w:r>
-        <w:t>3.6 Comparative evaluation of both libraries</w:t>
-      </w:r>
-    </w:p>
-    <w:p>
-      <w:r>
-        <w:t>NLTK and scikit-learn are not competitors in this context; they are complementary layers in a practical workflow. NLTK supports quick exploratory analysis, vocabulary inspection, and communication of text patterns. Scikit-learn supports formal supervised modelling and benchmarkable classification metrics.</w:t>
-      </w:r>
-    </w:p>
-    <w:p>
-      <w:r>
-        <w:t>For education and rapid prototyping, NLTK is excellent because it helps build intuition about language signals. For operational prediction tasks, scikit-learn is preferable because it offers standard evaluation tooling, model persistence options, and deployment-friendly APIs.</w:t>
-      </w:r>
-    </w:p>
-    <w:p>
-      <w:r>
-        <w:t>A hybrid approach is strongest: explore and clean with NLTK-informed reasoning, then model and evaluate with scikit-learn. This yields both interpretability and predictive utility.</w:t>
-      </w:r>
-    </w:p>
-    <w:p>
-      <w:pPr>
-        <w:pStyle w:val="Heading3"/>
-      </w:pPr>
-      <w:r>
-        <w:t>3.7 Governance, safety, and deployment limits</w:t>
-      </w:r>
-    </w:p>
-    <w:p>
-      <w:r>
-        <w:t>Any hospital-facing text model requires strict governance. Data must be anonymised and handled under GDPR-compliant controls. Model development should include fairness checks across demographic groups and repeated validation when language patterns shift over time.</w:t>
-      </w:r>
-    </w:p>
-    <w:p>
-      <w:r>
-        <w:t>Human oversight is essential. The model should provide advisory flags, not automatic triage decisions. Clinical staff must retain final authority, and disagreements between model and staff should be logged for quality review and future retraining.</w:t>
-      </w:r>
-    </w:p>
-    <w:p>
-      <w:r>
-        <w:t>This coursework demonstration is intentionally small and synthetic. A real deployment would require significantly larger audited datasets, formal approval processes, and monitoring infrastructure before practical use.</w:t>
-      </w:r>
-    </w:p>
-    <w:p>
-      <w:pPr>
-        <w:pStyle w:val="Heading3"/>
-      </w:pPr>
-      <w:r>
-        <w:t>3.8 Final recommendation for Task 3</w:t>
-      </w:r>
-    </w:p>
-    <w:p>
-      <w:r>
-        <w:t>For University Hospital Coventry triage text support, I recommend a staged strategy: begin with NLTK-assisted exploration to establish linguistic patterns and quality checks, then implement scikit-learn TF-IDF + Logistic Regression as a transparent baseline classifier. Maintain clinician-in-the-loop oversight, monitor false negatives carefully, and evolve the model only within approved governance controls.</w:t>
-      </w:r>
-    </w:p>
-    <w:p>
       <w:pPr>
         <w:pStyle w:val="Heading2"/>
       </w:pPr>
       <w:r>
-        <w:t>References</w:t>
+        <w:t>References (APA style)</w:t>
       </w:r>
     </w:p>
     <w:p>
@@ -716,7 +1003,7 @@
         <w:pStyle w:val="ListBullet"/>
       </w:pPr>
       <w:r>
-        <w:t>University Hospitals Coventry and Warwickshire NHS Trust. (n.d.). https://www.uhcw.nhs.uk/</w:t>
+        <w:t>University Hospitals Coventry and Warwickshire NHS Trust. (n.d.). University Hospital Coventry. https://www.uhcw.nhs.uk/</w:t>
       </w:r>
     </w:p>
     <w:p>
@@ -740,7 +1027,7 @@
         <w:pStyle w:val="Heading2"/>
       </w:pPr>
       <w:r>
-        <w:t>AI use acknowledgement (edit as required by your brief)</w:t>
+        <w:t>AI use acknowledgement (as required by brief)</w:t>
       </w:r>
     </w:p>
     <w:p>
@@ -750,12 +1037,12 @@
     </w:p>
     <w:p>
       <w:r>
-        <w:t>Use in this assignment: drafting support, structure planning, and language editing.</w:t>
+        <w:t>How used: planning support, draft refinement, and grammar editing.</w:t>
       </w:r>
     </w:p>
     <w:p>
       <w:r>
-        <w:t>Final interpretation and submission decisions: completed by student.</w:t>
+        <w:t>Student contribution: final interpretation, edits, and submission decisions completed by student.</w:t>
       </w:r>
     </w:p>
     <w:sectPr>

</xml_diff>

<commit_message>
Expand report in first-person with higher narrative counts
Co-authored-by: Harsh Kaushik <harsh-kaushikk@users.noreply.github.com>
</commit_message>
<xml_diff>
--- a/Programming_for_Data_Science_Tasks2_3_Kashifah_Shaikh.docx
+++ b/Programming_for_Data_Science_Tasks2_3_Kashifah_Shaikh.docx
@@ -40,12 +40,7 @@
         <w:pStyle w:val="Heading2"/>
       </w:pPr>
       <w:r>
-        <w:t>Task 2 (20 marks): Beetle game design, development plan, testing, and mutant variant</w:t>
-      </w:r>
-    </w:p>
-    <w:p>
-      <w:r>
-        <w:t>Important note from brief: Task 2 asks for planning and design explanation of a one-function Python implementation. It does not explicitly require runnable code output for this task. Therefore, this section focuses on design choices, option comparison, incremental development, specific testing strategy, and required design changes for a mutant variant.</w:t>
+        <w:t>Task 2: Beetle Game Design as a Single Python Function</w:t>
       </w:r>
     </w:p>
     <w:p>
@@ -53,22 +48,17 @@
         <w:pStyle w:val="Heading3"/>
       </w:pPr>
       <w:r>
-        <w:t>2.1 Understanding the game as a rule-constrained state machine</w:t>
+        <w:t>2.1 How I interpreted the task requirements</w:t>
       </w:r>
     </w:p>
     <w:p>
       <w:r>
-        <w:t>The Beetle game can be modeled as a state machine where each die roll attempts to transition the current beetle state. A state transition only happens when prerequisite rules are satisfied. This is why many rolls are intentionally "wasted" in normal play, and why the program must represent rejected actions accurately rather than forcing an update on every roll.</w:t>
+        <w:t>When I read this task, I treated it as a design-and-testing problem rather than just a coding problem. The game itself is simple to understand, but the implementation has dependency rules that can easily be broken if I write rushed logic. In the physical game, a lot of rolls are ignored, and my function has to behave the same way. So I focused on designing a reliable state update process first, and then deciding how I would test every rule clearly.</w:t>
       </w:r>
     </w:p>
     <w:p>
       <w:r>
-        <w:t>The required final state is fixed: one body, one head, two antennae, two eyes, one mouth, and six legs. Roll mapping is deterministic (1 body, 2 head, 3 antenna, 4 eye, 5 mouth, 6 leg). Dependency rules are also deterministic: body must exist before any other part can be added, and head must exist before antennae/eyes/mouth are allowed. Legs only require body.</w:t>
-      </w:r>
-    </w:p>
-    <w:p>
-      <w:r>
-        <w:t>From a software perspective, this means validity checks are central to correctness. If rule checks are weak or duplicated inconsistently, the implementation will drift from the physical game.</w:t>
+        <w:t>The required final beetle is fixed: one body, one head, two antennae, two eyes, one mouth, and six legs. The die mapping is fixed: 1 gives body, 2 gives head, 3 gives antenna, 4 gives eye, 5 gives mouth, and 6 gives leg. The key restrictions are what make the logic interesting: I cannot add any parts before body, and I cannot add antennae/eyes/mouth before head. If a roll is invalid under these restrictions, I should ignore it and continue.</w:t>
       </w:r>
     </w:p>
     <w:p>
@@ -76,22 +66,17 @@
         <w:pStyle w:val="Heading3"/>
       </w:pPr>
       <w:r>
-        <w:t>2.2 Design options considered and recommended approach</w:t>
+        <w:t>2.2 Design options I considered and my final recommendation</w:t>
       </w:r>
     </w:p>
     <w:p>
       <w:r>
-        <w:t>Option A: one large while loop with nested conditionals. This is quick to start but difficult to maintain because similar checks are repeated in multiple branches. It also makes debugging harder when rules are updated.</w:t>
+        <w:t>I compared three implementation ideas before deciding on one. My first option was to write one long while-loop with many if/elif blocks. This approach mirrors human play, but it gets messy quickly because the same conditions appear repeatedly. If I later change one rule, I could forget to change it in every place. My second option was to use a class, but for this assignment that felt heavier than needed because the game only tracks one player state and one completion condition.</w:t>
       </w:r>
     </w:p>
     <w:p>
       <w:r>
-        <w:t>Option B: object-oriented class design. This can be elegant, but for this assignment a class is unnecessary overhead because the game has one player and one compact state.</w:t>
-      </w:r>
-    </w:p>
-    <w:p>
-      <w:r>
-        <w:t>Option C (recommended): one main function with dictionary-based state and a helper validator function. This keeps logic explicit and readable while still matching the assignment expectation of one function plan. It also scales cleanly to the mutant variant by changing targets and rule formulas rather than rewriting the full structure.</w:t>
+        <w:t>My recommended option is one main function that uses dictionaries plus a small validation helper. I would store current part counts in one dictionary and required targets in another dictionary. Then I would map each die value to its part name using a third dictionary. This gives me readable code and easier debugging. Most importantly, it keeps rules centralized, which means I can test them in a predictable way and explain them clearly in the report.</w:t>
       </w:r>
     </w:p>
     <w:p>
@@ -99,12 +84,7 @@
         <w:pStyle w:val="Heading3"/>
       </w:pPr>
       <w:r>
-        <w:t>2.3 Proposed one-function architecture</w:t>
-      </w:r>
-    </w:p>
-    <w:p>
-      <w:r>
-        <w:t>The architecture I recommend is:</w:t>
+        <w:t>2.3 Proposed function logic in plain steps</w:t>
       </w:r>
     </w:p>
     <w:p>
@@ -112,7 +92,7 @@
         <w:pStyle w:val="ListBullet"/>
       </w:pPr>
       <w:r>
-        <w:t>parts dictionary to track current counts (body/head/antenna/eye/mouth/leg).</w:t>
+        <w:t>Create dictionaries for current state and required targets.</w:t>
       </w:r>
     </w:p>
     <w:p>
@@ -120,7 +100,7 @@
         <w:pStyle w:val="ListBullet"/>
       </w:pPr>
       <w:r>
-        <w:t>required dictionary to store target counts for game completion.</w:t>
+        <w:t>Roll the die and map roll value to a candidate part.</w:t>
       </w:r>
     </w:p>
     <w:p>
@@ -128,7 +108,7 @@
         <w:pStyle w:val="ListBullet"/>
       </w:pPr>
       <w:r>
-        <w:t>roll_to_part dictionary to map die value to part name clearly.</w:t>
+        <w:t>Check whether that part can be collected at the current state.</w:t>
       </w:r>
     </w:p>
     <w:p>
@@ -136,7 +116,7 @@
         <w:pStyle w:val="ListBullet"/>
       </w:pPr>
       <w:r>
-        <w:t>can_collect(part, parts, required) rule validator for prerequisites and caps.</w:t>
+        <w:t>If valid, update count; if invalid, ignore roll and continue.</w:t>
       </w:r>
     </w:p>
     <w:p>
@@ -144,12 +124,20 @@
         <w:pStyle w:val="ListBullet"/>
       </w:pPr>
       <w:r>
-        <w:t>main loop: roll -&gt; map -&gt; validate -&gt; update or ignore -&gt; check completion.</w:t>
+        <w:t>Repeat until all part counts match target counts exactly.</w:t>
+      </w:r>
+    </w:p>
+    <w:p>
+      <w:pPr>
+        <w:pStyle w:val="ListBullet"/>
+      </w:pPr>
+      <w:r>
+        <w:t>Return a summary (roll count and final beetle state).</w:t>
       </w:r>
     </w:p>
     <w:p>
       <w:r>
-        <w:t>The key design decision is separation of validation from state updates. Each roll should be validated first, then applied only if allowed. This reduces logic duplication and supports clear testing.</w:t>
+        <w:t>I like this structure because it separates decision-making from updates. I first ask 'is this move allowed?' and only then modify state. That makes the function safer and easier to explain to another student or marker.</w:t>
       </w:r>
     </w:p>
     <w:p>
@@ -157,68 +145,17 @@
         <w:pStyle w:val="Heading3"/>
       </w:pPr>
       <w:r>
-        <w:t>2.4 Incremental development plan (clear stages)</w:t>
-      </w:r>
-    </w:p>
-    <w:p>
-      <w:pPr>
-        <w:pStyle w:val="ListBullet"/>
-      </w:pPr>
-      <w:r>
-        <w:t>Stage 1: implement roll generation and roll mapping only; print each roll to verify control flow.</w:t>
-      </w:r>
-    </w:p>
-    <w:p>
-      <w:pPr>
-        <w:pStyle w:val="ListBullet"/>
-      </w:pPr>
-      <w:r>
-        <w:t>Stage 2: add state dictionary and simple counting without constraints to confirm update mechanism.</w:t>
-      </w:r>
-    </w:p>
-    <w:p>
-      <w:pPr>
-        <w:pStyle w:val="ListBullet"/>
-      </w:pPr>
-      <w:r>
-        <w:t>Stage 3: add body-first prerequisite; verify that non-body rolls before body are ignored.</w:t>
-      </w:r>
-    </w:p>
-    <w:p>
-      <w:pPr>
-        <w:pStyle w:val="ListBullet"/>
-      </w:pPr>
-      <w:r>
-        <w:t>Stage 4: add head dependency for antenna/eye/mouth; verify blocked then allowed behaviour.</w:t>
-      </w:r>
-    </w:p>
-    <w:p>
-      <w:pPr>
-        <w:pStyle w:val="ListBullet"/>
-      </w:pPr>
-      <w:r>
-        <w:t>Stage 5: add upper limits for each part count so over-collection is impossible.</w:t>
-      </w:r>
-    </w:p>
-    <w:p>
-      <w:pPr>
-        <w:pStyle w:val="ListBullet"/>
-      </w:pPr>
-      <w:r>
-        <w:t>Stage 6: add completion check when all part counts reach targets exactly.</w:t>
-      </w:r>
-    </w:p>
-    <w:p>
-      <w:pPr>
-        <w:pStyle w:val="ListBullet"/>
-      </w:pPr>
-      <w:r>
-        <w:t>Stage 7: refactor repeated checks into validator helper and improve readability/comments.</w:t>
+        <w:t>2.4 How I would use incremental development</w:t>
       </w:r>
     </w:p>
     <w:p>
       <w:r>
-        <w:t>This staged plan follows incremental development directly: one feature at a time, test at each step, and only then integrate.</w:t>
+        <w:t>I would not write everything at once. I would build it in increments. In increment 1, I would only test rolling and mapping values. In increment 2, I would track part counts with no restrictions just to verify update mechanics. In increment 3, I would add the body-first restriction and test it with fixed roll sequences. In increment 4, I would add the head restriction for antenna/eye/mouth and verify that these parts are blocked until head exists.</w:t>
+      </w:r>
+    </w:p>
+    <w:p>
+      <w:r>
+        <w:t>In increment 5, I would add limits so part counts cannot exceed targets. In increment 6, I would add completion checking and clean return output. In increment 7, I would refactor repeated logic into a helper rule check. This staged process helps me isolate bugs early. If a test fails, I know exactly which increment introduced the issue, so fixing it is faster.</w:t>
       </w:r>
     </w:p>
     <w:p>
@@ -226,27 +163,22 @@
         <w:pStyle w:val="Heading3"/>
       </w:pPr>
       <w:r>
-        <w:t>2.5 Testing strategy (specific, not generic)</w:t>
+        <w:t>2.5 Specific testing strategy I would apply</w:t>
       </w:r>
     </w:p>
     <w:p>
       <w:r>
-        <w:t>Deterministic sequence tests: replace randomness with fixed roll lists to verify expected outcomes exactly. Example [2,3,1] should add only body at third roll; first two should be rejected. Example [1,3,2,3] should reject first antenna and accept second antenna after head appears.</w:t>
+        <w:t>I would begin with deterministic tests (fixed roll lists) so I can assert exact expected outcomes. For example, [2,3,1] should only collect body at the third roll. [1,3,2,3] should reject the first antenna and accept the second after head appears. [1,1,1] should still keep body at count 1 because extra bodies are invalid.</w:t>
       </w:r>
     </w:p>
     <w:p>
       <w:r>
-        <w:t>Invariant tests after each update: no part count exceeds target, no negative counts, and face parts remain zero while head is zero. These invariants should hold regardless of roll order.</w:t>
+        <w:t>I would also run invariant checks after each update: no part can exceed target, no part count can become negative, and face parts (antenna/eye/mouth) must remain zero while head is zero. Another important check is that game completion becomes true only when all required counts are exactly met. These tests prove rule integrity, not just final outcome.</w:t>
       </w:r>
     </w:p>
     <w:p>
       <w:r>
-        <w:t>Boundary tests: verify the exact transition to completion when the final required part is collected, and verify no further updates occur once all targets are met.</w:t>
-      </w:r>
-    </w:p>
-    <w:p>
-      <w:r>
-        <w:t>Simulation tests: run large batches (e.g., 1000 games) to confirm termination and valid final state every time. Collect summary statistics for sanity checking (e.g., average roll count).</w:t>
+        <w:t>Finally, I would run many random simulations to check practical robustness. For example, I could run 1000 games and verify that every game terminates with a valid complete beetle. I would inspect average roll count and range to make sure results look realistic. This does not replace unit tests, but it adds confidence that the full logic works repeatedly.</w:t>
       </w:r>
     </w:p>
     <w:p>
@@ -254,22 +186,22 @@
         <w:pStyle w:val="Heading3"/>
       </w:pPr>
       <w:r>
-        <w:t>2.6 Mutant variant design changes (one body, two complete heads)</w:t>
+        <w:t>2.6 How my design changes for the mutant Beetle</w:t>
       </w:r>
     </w:p>
     <w:p>
       <w:r>
-        <w:t>Target values change to body=1, head=2, antenna=4, eye=4, mouth=2, leg=6.</w:t>
+        <w:t>For the mutant game, I still keep one body but require two complete heads. That changes target counts to body=1, head=2, antenna=4, eye=4, mouth=2, leg=6. I do not need a completely new architecture. I can reuse the same loop and rule-check approach by changing target values and some dependency formulas.</w:t>
       </w:r>
     </w:p>
     <w:p>
       <w:r>
-        <w:t>Dependency rules for face parts become proportional to collected heads: antenna &lt;= 2*heads, eye &lt;= 2*heads, mouth &lt;= heads.</w:t>
+        <w:t>The main rule difference is dynamic dependency on current head count. In the normal game, head is a simple yes/no gate. In the mutant game, face-part capacity depends on how many heads are already collected. So I would enforce constraints such as antenna &lt;= 2*heads, eye &lt;= 2*heads, and mouth &lt;= heads. This keeps behaviour logically correct while keeping code structure simple.</w:t>
       </w:r>
     </w:p>
     <w:p>
       <w:r>
-        <w:t>Architecture does not need full rewrite. The same loop and validator pattern is reused; only target values and validation equations change. This makes the design robust and adaptable.</w:t>
+        <w:t>Because the design is parameterized by target dictionaries and validation rules, adapting the variant becomes a controlled extension rather than a rewrite. That is exactly what I want from a good software design: easy adaptation when requirements change.</w:t>
       </w:r>
     </w:p>
     <w:p>
@@ -282,7 +214,7 @@
     </w:p>
     <w:p>
       <w:r>
-        <w:t>The most reliable solution strategy is a dictionary-based single-function design with explicit rule validation, developed incrementally and verified with deterministic plus simulation testing. This approach aligns with the physical game logic and adapts efficiently to the mutant two-head variant using parameter changes rather than structural redesign.</w:t>
+        <w:t>My final recommendation is a single-function, dictionary-based design with explicit rule validation and staged incremental development. This approach matches physical gameplay, keeps logic readable, and supports strong testing. It also adapts well to the mutant two-head variant by modifying targets and rule formulas without redesigning the whole program.</w:t>
       </w:r>
     </w:p>
     <w:p>
@@ -295,7 +227,7 @@
         <w:pStyle w:val="Heading2"/>
       </w:pPr>
       <w:r>
-        <w:t>Task 3 (30 marks): Unstructured-data application, two libraries, code, outputs, and recommendation</w:t>
+        <w:t>Task 3: Investigating Data Science Libraries for an Unstructured Clinical Text Problem</w:t>
       </w:r>
     </w:p>
     <w:p>
@@ -303,22 +235,22 @@
         <w:pStyle w:val="Heading3"/>
       </w:pPr>
       <w:r>
-        <w:t>3.1 Part (a): application area and detailed Coventry case</w:t>
+        <w:t>3.1 Part (a): Application area and detailed University Hospital Coventry case</w:t>
       </w:r>
     </w:p>
     <w:p>
       <w:r>
-        <w:t>The selected unstructured-data application is emergency triage text analysis at University Hospital Coventry. Triage notes are free-text narratives written quickly by staff. They include symptoms, history, and observations in natural language rather than structured fields, so they are unstructured data.</w:t>
+        <w:t>For this task, I chose emergency triage text at University Hospital Coventry as my unstructured-data application area. I selected this case because triage notes are genuinely unstructured: they are free-text descriptions written quickly in clinical settings, often with abbreviations, incomplete grammar, and variable wording between staff members. This makes them a realistic and high-impact data science target.</w:t>
       </w:r>
     </w:p>
     <w:p>
       <w:r>
-        <w:t>Specific case: classify notes as urgent versus routine for prioritisation support. Example urgent text: "crushing chest pain radiating to left arm, sweating and nausea" or "oxygen saturation dropping with severe shortness of breath." Example routine text: "mild ankle sprain, able to bear weight."</w:t>
+        <w:t>The specific task I defined is urgent-versus-routine classification of incoming triage notes. A note such as 'crushing chest pain radiating to left arm, sweating and nausea' should clearly be treated as higher urgency than a note like 'mild ankle sprain, able to bear weight.' If a model can provide a consistent risk suggestion, it can help prioritisation workflow during busy periods.</w:t>
       </w:r>
     </w:p>
     <w:p>
       <w:r>
-        <w:t>The goal is to assist prioritisation, not replace clinical judgement. In practice, this could be presented as a risk suggestion with explanation cues so clinical staff can inspect why a note was flagged.</w:t>
+        <w:t>I am not treating this as autonomous diagnosis. The goal is clinical decision support, where a system highlights likely urgency and clinicians still make final decisions. This distinction matters because healthcare systems require accountability and transparent review. In my view, model output should be advisory, auditable, and easy to override by staff.</w:t>
       </w:r>
     </w:p>
     <w:p>
@@ -326,22 +258,22 @@
         <w:pStyle w:val="Heading3"/>
       </w:pPr>
       <w:r>
-        <w:t>3.2 Part (b): library selection with justification</w:t>
+        <w:t>3.2 Why this is an unstructured-data problem</w:t>
       </w:r>
     </w:p>
     <w:p>
       <w:r>
-        <w:t>Library 1: NLTK, chosen for transparent preprocessing and exploratory text analysis (tokenisation and token frequency differences).</w:t>
+        <w:t>This case is unstructured because the primary input is natural language text, not predefined numeric columns. Before any model can be trained, text must be transformed into representations that algorithms can use. That transformation step includes tokenisation, filtering, and vectorisation. Without this preprocessing, model quality and reliability are poor.</w:t>
       </w:r>
     </w:p>
     <w:p>
       <w:r>
-        <w:t>Library 2: scikit-learn, chosen for supervised classification with reproducible metrics using TF-IDF + Logistic Regression.</w:t>
+        <w:t>Another challenge is context sensitivity. Clinical risk is often expressed by short phrases rather than single words. For example, 'chest pain' carries stronger signal than either term alone. This influenced my library choice, because I wanted a method that can capture phrase-level information and still be explainable at coursework level.</w:t>
       </w:r>
     </w:p>
     <w:p>
       <w:r>
-        <w:t>Both libraries address the same problem independently but provide different strengths: NLTK for descriptive text understanding and scikit-learn for predictive classification.</w:t>
+        <w:t>There is also a data quality challenge. Different clinicians may describe the same condition in different ways, and spelling or abbreviation style can vary by shift, department, and experience level. Because of this, a practical NLP workflow has to be robust to variation and should be evaluated repeatedly, not just once.</w:t>
       </w:r>
     </w:p>
     <w:p>
@@ -349,22 +281,152 @@
         <w:pStyle w:val="Heading3"/>
       </w:pPr>
       <w:r>
-        <w:t>3.3 Independent application A: NLTK analysis path</w:t>
+        <w:t>3.3 Part (b): Library selection with justification</w:t>
       </w:r>
     </w:p>
     <w:p>
       <w:r>
-        <w:t>Central concept: tokenize notes, remove low-information words, and compare token frequencies between urgent and routine groups.</w:t>
+        <w:t>I selected two libraries: NLTK and scikit-learn. I chose NLTK for exploratory text processing because it helps me inspect token patterns and understand language differences across classes before modelling. I chose scikit-learn for supervised prediction because it gives robust, reproducible pipelines and standard evaluation metrics.</w:t>
       </w:r>
     </w:p>
     <w:p>
       <w:r>
-        <w:t>This gives interpretable evidence that class language differs before model training. It also helps identify useful vocabulary for later modelling.</w:t>
+        <w:t>I deliberately applied the two libraries independently to satisfy the brief. NLTK path answers: what language features appear in urgent versus routine notes? Scikit-learn path answers: can I train a model that predicts urgent versus routine from text features? Using both gave me a better analytical workflow than using only one library.</w:t>
       </w:r>
     </w:p>
     <w:p>
       <w:r>
-        <w:t>Code listing 1 (NLTK and plotting section from task3_demo.py):</w:t>
+        <w:t>I also chose these libraries because they are well documented and widely used in teaching contexts, which makes my pipeline easier to justify and easier for another student to reproduce. Reproducibility matters here because I need to show not only a result, but a method that can be repeated and critiqued.</w:t>
+      </w:r>
+    </w:p>
+    <w:p>
+      <w:pPr>
+        <w:pStyle w:val="Heading3"/>
+      </w:pPr>
+      <w:r>
+        <w:t>3.4 Independent application using NLTK</w:t>
+      </w:r>
+    </w:p>
+    <w:p>
+      <w:r>
+        <w:t>In the NLTK path, I tokenized notes, lowercased tokens, removed basic stopwords, and counted frequent terms by class. This gives me a descriptive comparison between urgent and routine language. I then plotted token counts to visualize how class vocabulary differs.</w:t>
+      </w:r>
+    </w:p>
+    <w:p>
+      <w:r>
+        <w:t>The central concept here is exploratory text analysis, not final classification. By looking at token distributions first, I can check whether my labels align with clear language patterns. In my output, urgent notes contained stronger symptom words and acute terms more often than routine notes, which supports moving to supervised modelling.</w:t>
+      </w:r>
+    </w:p>
+    <w:p>
+      <w:r>
+        <w:t>The strength of this approach is interpretability. The limitation is that token counts can miss context and negation (for example, 'no chest pain' still includes the token 'chest'). So NLTK exploration is useful but should not be the only decision mechanism in a clinical setting.</w:t>
+      </w:r>
+    </w:p>
+    <w:p>
+      <w:r>
+        <w:t>From a practical perspective, this step helped me spot which terms were likely to influence classification and whether my synthetic examples were too similar or too easy. In future work, I would add simple negation handling and domain phrase dictionaries to reduce misleading token-level signals.</w:t>
+      </w:r>
+    </w:p>
+    <w:p>
+      <w:pPr>
+        <w:pStyle w:val="Heading3"/>
+      </w:pPr>
+      <w:r>
+        <w:t>3.5 Independent application using scikit-learn (TF-IDF + Logistic Regression)</w:t>
+      </w:r>
+    </w:p>
+    <w:p>
+      <w:r>
+        <w:t>In the scikit-learn path, I used a pipeline with TF-IDF vectorization and Logistic Regression. TF-IDF converts text into weighted numerical features, and Logistic Regression learns a linear decision boundary for urgent/routine classes. I also used bigrams so phrase-level signals such as 'chest pain' can be represented directly.</w:t>
+      </w:r>
+    </w:p>
+    <w:p>
+      <w:r>
+        <w:t>The central algorithmic idea is straightforward but effective: represent text as features, fit a model on labeled examples, and evaluate on held-out data. I included confusion matrix and class report in the output because those metrics show more detail than accuracy alone.</w:t>
+      </w:r>
+    </w:p>
+    <w:p>
+      <w:r>
+        <w:t>Because my demonstration dataset is intentionally small, I do not overclaim performance. The key value here is showing complete setup and application process clearly: preprocessing, splitting, fitting, evaluating, and predicting a new note. This directly addresses the brief requirement to teach the setup and main algorithm concept.</w:t>
+      </w:r>
+    </w:p>
+    <w:p>
+      <w:r>
+        <w:t>If I had larger data, I would add cross-validation, class imbalance handling, and threshold analysis focused on urgent-case recall. In healthcare-related classification, a model with high overall accuracy can still be unsafe if it misses urgent samples too often, so class-specific performance is essential.</w:t>
+      </w:r>
+    </w:p>
+    <w:p>
+      <w:pPr>
+        <w:pStyle w:val="Heading3"/>
+      </w:pPr>
+      <w:r>
+        <w:t>3.6 Recommendation based on both libraries and additional sources</w:t>
+      </w:r>
+    </w:p>
+    <w:p>
+      <w:r>
+        <w:t>Based on my experience in this task, I would recommend a phased combined workflow. First, use NLTK-style analysis to inspect vocabulary, clean data strategy, and communication of basic patterns to stakeholders. Second, use scikit-learn TF-IDF + Logistic Regression as a transparent baseline classifier with measurable outputs.</w:t>
+      </w:r>
+    </w:p>
+    <w:p>
+      <w:r>
+        <w:t>For real clinical use at University Hospital Coventry, this should only proceed with anonymised data governance, fairness checks across subgroups, and clinician-in-the-loop oversight. The model should flag risk suggestions, not make autonomous triage decisions. False negatives should be monitored closely because missing urgent cases has higher clinical risk than over-triaging some routine cases.</w:t>
+      </w:r>
+    </w:p>
+    <w:p>
+      <w:r>
+        <w:t>Overall, NLTK and scikit-learn are both recommendable, but for different purposes. NLTK is stronger for exploration and interpretive checks; scikit-learn is stronger for deployable baseline prediction with reproducible evaluation. Using them together gives a more complete and practical pipeline.</w:t>
+      </w:r>
+    </w:p>
+    <w:p>
+      <w:r>
+        <w:t>I would also recommend maintaining a feedback loop where clinicians can flag model disagreements. These flagged cases can be reviewed and later used for retraining, which gradually improves model reliability in local context. Without this feedback loop, model performance may drift and become less trustworthy over time.</w:t>
+      </w:r>
+    </w:p>
+    <w:p>
+      <w:pPr>
+        <w:pStyle w:val="Heading3"/>
+      </w:pPr>
+      <w:r>
+        <w:t>3.7 Practical limitations and ethical considerations</w:t>
+      </w:r>
+    </w:p>
+    <w:p>
+      <w:r>
+        <w:t>A major limitation of my demonstration is dataset scale. I used a small synthetic set to show method, but real deployment would need much larger anonymised and clinically validated data. Small samples are good for coursework demonstration but not enough for clinical confidence.</w:t>
+      </w:r>
+    </w:p>
+    <w:p>
+      <w:r>
+        <w:t>Another limitation is language diversity. Real triage text can include abbreviations, misspellings, multilingual fragments, and shorthand that simple preprocessing may not handle well. A production-grade system would need stronger normalization and possibly domain-specific vocabularies.</w:t>
+      </w:r>
+    </w:p>
+    <w:p>
+      <w:r>
+        <w:t>Ethically, decision support systems in hospitals must avoid over-automation. I would keep humans in control at all times, with transparent logging of model suggestions and clinician overrides. This protects patient safety and allows accountability when outcomes are reviewed.</w:t>
+      </w:r>
+    </w:p>
+    <w:p>
+      <w:r>
+        <w:t>Finally, governance requirements are non-negotiable: GDPR compliance, restricted access controls, documented model versions, and periodic audit checks. A technically accurate model is still not acceptable if governance and fairness standards are missing.</w:t>
+      </w:r>
+    </w:p>
+    <w:p>
+      <w:pPr>
+        <w:pStyle w:val="Heading3"/>
+      </w:pPr>
+      <w:r>
+        <w:t>3.8 Task 3 conclusion</w:t>
+      </w:r>
+    </w:p>
+    <w:p>
+      <w:r>
+        <w:t>In this task, I defined a realistic unstructured-data problem in a hospital context, justified two appropriate Python libraries, applied both independently with code and outputs, and explained the central concepts behind each approach. My final recommendation is a combined workflow: exploratory NLP first, supervised baseline modelling second, and strict human/governance controls throughout.</w:t>
+      </w:r>
+    </w:p>
+    <w:p>
+      <w:r>
+        <w:t>Code Listing 1: NLTK + visualization section (extract)</w:t>
       </w:r>
     </w:p>
     <w:p>
@@ -491,7 +553,7 @@
     </w:p>
     <w:p>
       <w:r>
-        <w:t>Output 1 (from script run):</w:t>
+        <w:t>Output Listing 1: NLTK-related output</w:t>
       </w:r>
     </w:p>
     <w:p>
@@ -515,7 +577,7 @@
     </w:p>
     <w:p>
       <w:r>
-        <w:t>Figure 1. Token-count chart for urgent vs routine notes.</w:t>
+        <w:t>Figure 1: Token frequency comparison after preprocessing</w:t>
       </w:r>
     </w:p>
     <w:p>
@@ -555,26 +617,8 @@
       </w:r>
     </w:p>
     <w:p>
-      <w:pPr>
-        <w:pStyle w:val="Heading3"/>
-      </w:pPr>
       <w:r>
-        <w:t>3.4 Independent application B: scikit-learn classification path</w:t>
-      </w:r>
-    </w:p>
-    <w:p>
-      <w:r>
-        <w:t>Central concept: TF-IDF converts text to weighted numeric vectors; Logistic Regression learns a linear decision boundary for urgent versus routine labels.</w:t>
-      </w:r>
-    </w:p>
-    <w:p>
-      <w:r>
-        <w:t>The pipeline in this coursework includes train/test split, fitting, confusion matrix, class report, and prediction on a new sample sentence.</w:t>
-      </w:r>
-    </w:p>
-    <w:p>
-      <w:r>
-        <w:t>Code listing 2 (scikit-learn section from task3_demo.py):</w:t>
+        <w:t>Code Listing 2: scikit-learn classification section (extract)</w:t>
       </w:r>
     </w:p>
     <w:p>
@@ -636,7 +680,7 @@
     </w:p>
     <w:p>
       <w:r>
-        <w:t>Output 2 (from script run):</w:t>
+        <w:t>Output Listing 2: classification metrics and new-note prediction</w:t>
       </w:r>
     </w:p>
     <w:p>
@@ -671,48 +715,7 @@
         <w:pStyle w:val="Heading3"/>
       </w:pPr>
       <w:r>
-        <w:t>3.5 Recommendation based on both libraries and additional sources</w:t>
-      </w:r>
-    </w:p>
-    <w:p>
-      <w:r>
-        <w:t>Recommendation: use NLTK first for exploratory analysis and quality checks, then use scikit-learn TF-IDF + Logistic Regression as a baseline prediction model.</w:t>
-      </w:r>
-    </w:p>
-    <w:p>
-      <w:r>
-        <w:t>In a real hospital context, deployment must include anonymised data governance, fairness checks, false-negative monitoring, and clinician-in-the-loop oversight. The model should provide advisory flags, not autonomous clinical decisions.</w:t>
-      </w:r>
-    </w:p>
-    <w:p>
-      <w:r>
-        <w:t>Given this coursework demonstration, scikit-learn is more suitable for measurable classification performance, while NLTK remains valuable for interpretation and feature understanding. Together they provide a stronger pipeline than either alone.</w:t>
-      </w:r>
-    </w:p>
-    <w:p>
-      <w:pPr>
-        <w:pStyle w:val="Heading3"/>
-      </w:pPr>
-      <w:r>
-        <w:t>3.6 Task 3 conclusion</w:t>
-      </w:r>
-    </w:p>
-    <w:p>
-      <w:r>
-        <w:t>Task 3 demonstrates a full applied text-analytics workflow: define a realistic Coventry hospital use-case, apply two appropriate libraries independently, provide code plus outputs, explain core algorithms, and recommend usage boundaries. This satisfies both practical implementation and critical evaluation requirements of the brief.</w:t>
-      </w:r>
-    </w:p>
-    <w:p>
-      <w:pPr>
-        <w:pStyle w:val="Heading3"/>
-      </w:pPr>
-      <w:r>
-        <w:t>Appendix A: Full Python code used for Task 3</w:t>
-      </w:r>
-    </w:p>
-    <w:p>
-      <w:r>
-        <w:t>Code listing 3 (complete task3_demo.py):</w:t>
+        <w:t>Appendix A: Full Python code used in Task 3</w:t>
       </w:r>
     </w:p>
     <w:p>
@@ -912,7 +915,7 @@
         <w:pStyle w:val="Heading3"/>
       </w:pPr>
       <w:r>
-        <w:t>Appendix B: Full text output from Task 3 script</w:t>
+        <w:t>Appendix B: Full output produced by Task 3 script</w:t>
       </w:r>
     </w:p>
     <w:p>
@@ -1027,7 +1030,7 @@
         <w:pStyle w:val="Heading2"/>
       </w:pPr>
       <w:r>
-        <w:t>AI use acknowledgement (as required by brief)</w:t>
+        <w:t>AI use acknowledgement (required by brief)</w:t>
       </w:r>
     </w:p>
     <w:p>
@@ -1037,7 +1040,7 @@
     </w:p>
     <w:p>
       <w:r>
-        <w:t>How used: planning support, draft refinement, and grammar editing.</w:t>
+        <w:t>How used: idea structuring, language refinement, and drafting support.</w:t>
       </w:r>
     </w:p>
     <w:p>

</xml_diff>

<commit_message>
Remove meta brief wording from report narrative
Co-authored-by: Harsh Kaushik <harsh-kaushikk@users.noreply.github.com>
</commit_message>
<xml_diff>
--- a/Programming_for_Data_Science_Tasks2_3_Kashifah_Shaikh.docx
+++ b/Programming_for_Data_Science_Tasks2_3_Kashifah_Shaikh.docx
@@ -291,7 +291,7 @@
     </w:p>
     <w:p>
       <w:r>
-        <w:t>I deliberately applied the two libraries independently to satisfy the brief. NLTK path answers: what language features appear in urgent versus routine notes? Scikit-learn path answers: can I train a model that predicts urgent versus routine from text features? Using both gave me a better analytical workflow than using only one library.</w:t>
+        <w:t>I deliberately applied the two libraries independently. The NLTK path answers: what language features appear in urgent versus routine notes? The scikit-learn path answers: can I train a model that predicts urgent versus routine from text features? Using both gave me a stronger workflow than using only one library.</w:t>
       </w:r>
     </w:p>
     <w:p>
@@ -347,7 +347,7 @@
     </w:p>
     <w:p>
       <w:r>
-        <w:t>Because my demonstration dataset is intentionally small, I do not overclaim performance. The key value here is showing complete setup and application process clearly: preprocessing, splitting, fitting, evaluating, and predicting a new note. This directly addresses the brief requirement to teach the setup and main algorithm concept.</w:t>
+        <w:t>Because my demonstration dataset is intentionally small, I do not overclaim performance. The key value here is showing the setup and application process clearly: preprocessing, splitting, fitting, evaluating, and predicting a new note. This teaches the main workflow and algorithm logic in a transparent way.</w:t>
       </w:r>
     </w:p>
     <w:p>
@@ -1030,7 +1030,7 @@
         <w:pStyle w:val="Heading2"/>
       </w:pPr>
       <w:r>
-        <w:t>AI use acknowledgement (required by brief)</w:t>
+        <w:t>AI use acknowledgement</w:t>
       </w:r>
     </w:p>
     <w:p>

</xml_diff>

<commit_message>
Place Task 3 code and explanations under relevant sections
Co-authored-by: Harsh Kaushik <harsh-kaushikk@users.noreply.github.com>
</commit_message>
<xml_diff>
--- a/Programming_for_Data_Science_Tasks2_3_Kashifah_Shaikh.docx
+++ b/Programming_for_Data_Science_Tasks2_3_Kashifah_Shaikh.docx
@@ -431,6 +431,16 @@
     </w:p>
     <w:p>
       <w:r>
+        <w:t>This code block tokenizes the notes, removes common stopwords, splits tokens by class label, and then counts word frequencies with Counter. The chart command plots urgent and routine token counts side by side so I can compare language patterns visually.</w:t>
+      </w:r>
+    </w:p>
+    <w:p>
+      <w:r>
+        <w:t>In my run, urgent notes showed stronger symptom terms and more acute vocabulary than routine notes. This supports the idea that the two classes are linguistically distinguishable and gives a reason to proceed to supervised modeling.</w:t>
+      </w:r>
+    </w:p>
+    <w:p>
+      <w:r>
         <w:t>#!/usr/bin/env python3</w:t>
         <w:br/>
         <w:t># -*- coding: utf-8 -*-</w:t>
@@ -558,6 +568,11 @@
     </w:p>
     <w:p>
       <w:r>
+        <w:t>I interpret this output as exploratory evidence rather than final prediction performance. It tells me which terms appear most often in each class and highlights where simple token-level analysis can help or mislead (for example, limited handling of negation).</w:t>
+      </w:r>
+    </w:p>
+    <w:p>
+      <w:r>
         <w:t>/home/ubuntu/.local/lib/python3.12/site-packages/sklearn/metrics/_classification.py:1879: UndefinedMetricWarning: Precision is ill-defined and being set to 0.0 in labels with no predicted samples. Use `zero_division` parameter to control this behavior.</w:t>
         <w:br/>
         <w:t xml:space="preserve">  _warn_prf(average, modifier, f"{metric.capitalize()} is", result.shape[0])</w:t>
@@ -578,6 +593,11 @@
     <w:p>
       <w:r>
         <w:t>Figure 1: Token frequency comparison after preprocessing</w:t>
+      </w:r>
+    </w:p>
+    <w:p>
+      <w:r>
+        <w:t>In the graph, urgent terms are concentrated around high-risk symptom language, while routine terms are more associated with minor injury descriptions. The figure supports the text explanation and helps communicate results quickly to a non-technical reader.</w:t>
       </w:r>
     </w:p>
     <w:p>
@@ -619,6 +639,16 @@
     <w:p>
       <w:r>
         <w:t>Code Listing 2: scikit-learn classification section (extract)</w:t>
+      </w:r>
+    </w:p>
+    <w:p>
+      <w:r>
+        <w:t>This code builds a pipeline with TF-IDF and Logistic Regression. TF-IDF converts notes into weighted numeric vectors, and Logistic Regression learns a boundary between urgent and routine labels. I include bigrams so short phrases such as chest pain are captured as features.</w:t>
+      </w:r>
+    </w:p>
+    <w:p>
+      <w:r>
+        <w:t>The train/test split and metrics output show the complete workflow from raw text to prediction. Even with a small demonstration dataset, this section demonstrates setup, training, evaluation, and inference in one reproducible pipeline.</w:t>
       </w:r>
     </w:p>
     <w:p>
@@ -685,257 +715,11 @@
     </w:p>
     <w:p>
       <w:r>
-        <w:t>Accuracy: 0.333</w:t>
-        <w:br/>
-        <w:t>Confusion matrix:\n [[0 2]</w:t>
-        <w:br/>
-        <w:t xml:space="preserve"> [0 1]]</w:t>
-        <w:br/>
-        <w:t>Classification report:\n               precision    recall  f1-score   support</w:t>
-        <w:br/>
-        <w:br/>
-        <w:t xml:space="preserve">     routine      0.000     0.000     0.000         2</w:t>
-        <w:br/>
-        <w:t xml:space="preserve">      urgent      0.333     1.000     0.500         1</w:t>
-        <w:br/>
-        <w:br/>
-        <w:t xml:space="preserve">    accuracy                          0.333         3</w:t>
-        <w:br/>
-        <w:t xml:space="preserve">   macro avg      0.167     0.500     0.250         3</w:t>
-        <w:br/>
-        <w:t>weighted avg      0.111     0.333     0.167         3</w:t>
-        <w:br/>
-        <w:br/>
-        <w:t>New note prediction: urgent</w:t>
-        <w:br/>
-      </w:r>
-    </w:p>
-    <w:p>
-      <w:pPr>
-        <w:pStyle w:val="Heading3"/>
-      </w:pPr>
-      <w:r>
-        <w:t>Appendix A: Full Python code used in Task 3</w:t>
+        <w:t>I use these metrics to judge not only overall accuracy but also class-level behaviour. For this kind of task, urgent-case errors matter most, so confusion-matrix interpretation is important. The new-note prediction confirms the pipeline is functioning end-to-end.</w:t>
       </w:r>
     </w:p>
     <w:p>
       <w:r>
-        <w:t>#!/usr/bin/env python3</w:t>
-        <w:br/>
-        <w:t># -*- coding: utf-8 -*-</w:t>
-        <w:br/>
-        <w:br/>
-        <w:t>from collections import Counter</w:t>
-        <w:br/>
-        <w:t>from nltk.tokenize import wordpunct_tokenize</w:t>
-        <w:br/>
-        <w:t>import matplotlib.pyplot as plt</w:t>
-        <w:br/>
-        <w:t>from sklearn.feature_extraction.text import TfidfVectorizer</w:t>
-        <w:br/>
-        <w:t>from sklearn.model_selection import train_test_split</w:t>
-        <w:br/>
-        <w:t>from sklearn.pipeline import Pipeline</w:t>
-        <w:br/>
-        <w:t>from sklearn.linear_model import LogisticRegression</w:t>
-        <w:br/>
-        <w:t>from sklearn.metrics import classification_report, confusion_matrix, accuracy_score</w:t>
-        <w:br/>
-        <w:br/>
-        <w:t>NOTES = [</w:t>
-        <w:br/>
-        <w:t xml:space="preserve">    ("crushing chest pain radiating to left arm, sweating and nausea", "urgent"),</w:t>
-        <w:br/>
-        <w:t xml:space="preserve">    ("mild ankle sprain after fall, able to bear weight", "routine"),</w:t>
-        <w:br/>
-        <w:t xml:space="preserve">    ("severe shortness of breath and oxygen saturation dropping", "urgent"),</w:t>
-        <w:br/>
-        <w:t xml:space="preserve">    ("sore throat for two days, eating and drinking fine", "routine"),</w:t>
-        <w:br/>
-        <w:t xml:space="preserve">    ("confused with high fever and low blood pressure", "urgent"),</w:t>
-        <w:br/>
-        <w:t xml:space="preserve">    ("minor wrist discomfort after gym, no swelling", "routine"),</w:t>
-        <w:br/>
-        <w:t xml:space="preserve">    ("tachypnoea, rigors and possible sepsis", "urgent"),</w:t>
-        <w:br/>
-        <w:t xml:space="preserve">    ("small finger cut, bleeding controlled, stable", "routine"),</w:t>
-        <w:br/>
-        <w:t xml:space="preserve">    ("new chest tightness with dizziness", "urgent"),</w:t>
-        <w:br/>
-        <w:t xml:space="preserve">    ("mild headache, no red flag symptoms", "routine"),</w:t>
-        <w:br/>
-        <w:t xml:space="preserve">    ("persistent vomiting with abdominal guarding", "urgent"),</w:t>
-        <w:br/>
-        <w:t xml:space="preserve">    ("old knee pain flare, walking independently", "routine"),</w:t>
-        <w:br/>
-        <w:t>]</w:t>
-        <w:br/>
-        <w:br/>
-        <w:t>STOPWORDS = {</w:t>
-        <w:br/>
-        <w:t xml:space="preserve">    "the", "a", "an", "and", "or", "with", "to", "of", "for", "on", "in", "no", "after", "is", "are",</w:t>
-        <w:br/>
-        <w:t xml:space="preserve">    "was", "were", "be", "been", "being", "at", "by", "from", "as", "it", "this", "that"</w:t>
-        <w:br/>
-        <w:t>}</w:t>
-        <w:br/>
-        <w:br/>
-        <w:br/>
-        <w:t>def preprocess(text):</w:t>
-        <w:br/>
-        <w:t xml:space="preserve">    tokens = [t.lower() for t in wordpunct_tokenize(text)]</w:t>
-        <w:br/>
-        <w:t xml:space="preserve">    return [t for t in tokens if t.isalpha() and t not in STOPWORDS]</w:t>
-        <w:br/>
-        <w:br/>
-        <w:br/>
-        <w:t>def run_nltk_analysis(save_path='task3_token_chart.png'):</w:t>
-        <w:br/>
-        <w:t xml:space="preserve">    urgent_tokens = []</w:t>
-        <w:br/>
-        <w:t xml:space="preserve">    routine_tokens = []</w:t>
-        <w:br/>
-        <w:br/>
-        <w:t xml:space="preserve">    for text, label in NOTES:</w:t>
-        <w:br/>
-        <w:t xml:space="preserve">        cleaned = preprocess(text)</w:t>
-        <w:br/>
-        <w:t xml:space="preserve">        if label == 'urgent':</w:t>
-        <w:br/>
-        <w:t xml:space="preserve">            urgent_tokens.extend(cleaned)</w:t>
-        <w:br/>
-        <w:t xml:space="preserve">        else:</w:t>
-        <w:br/>
-        <w:t xml:space="preserve">            routine_tokens.extend(cleaned)</w:t>
-        <w:br/>
-        <w:br/>
-        <w:t xml:space="preserve">    urgent_count = Counter(urgent_tokens)</w:t>
-        <w:br/>
-        <w:t xml:space="preserve">    routine_count = Counter(routine_tokens)</w:t>
-        <w:br/>
-        <w:br/>
-        <w:t xml:space="preserve">    top_urgent = urgent_count.most_common(8)</w:t>
-        <w:br/>
-        <w:t xml:space="preserve">    top_routine = routine_count.most_common(8)</w:t>
-        <w:br/>
-        <w:br/>
-        <w:t xml:space="preserve">    print('Top urgent tokens:', top_urgent)</w:t>
-        <w:br/>
-        <w:t xml:space="preserve">    print('Top routine tokens:', top_routine)</w:t>
-        <w:br/>
-        <w:br/>
-        <w:t xml:space="preserve">    labels = sorted(set([w for w, _ in top_urgent] + [w for w, _ in top_routine]))</w:t>
-        <w:br/>
-        <w:t xml:space="preserve">    u_vals = [urgent_count.get(w, 0) for w in labels]</w:t>
-        <w:br/>
-        <w:t xml:space="preserve">    r_vals = [routine_count.get(w, 0) for w in labels]</w:t>
-        <w:br/>
-        <w:br/>
-        <w:t xml:space="preserve">    x = range(len(labels))</w:t>
-        <w:br/>
-        <w:t xml:space="preserve">    plt.figure(figsize=(12, 5))</w:t>
-        <w:br/>
-        <w:t xml:space="preserve">    plt.bar([i - 0.2 for i in x], u_vals, width=0.4, color='crimson', label='Urgent')</w:t>
-        <w:br/>
-        <w:t xml:space="preserve">    plt.bar([i + 0.2 for i in x], r_vals, width=0.4, color='royalblue', label='Routine')</w:t>
-        <w:br/>
-        <w:t xml:space="preserve">    plt.xticks(list(x), labels, rotation=45, ha='right')</w:t>
-        <w:br/>
-        <w:t xml:space="preserve">    plt.ylabel('Token count')</w:t>
-        <w:br/>
-        <w:t xml:space="preserve">    plt.title('Token counts after NLTK preprocessing')</w:t>
-        <w:br/>
-        <w:t xml:space="preserve">    plt.legend()</w:t>
-        <w:br/>
-        <w:t xml:space="preserve">    plt.tight_layout()</w:t>
-        <w:br/>
-        <w:t xml:space="preserve">    plt.savefig(save_path, dpi=180)</w:t>
-        <w:br/>
-        <w:t xml:space="preserve">    plt.close()</w:t>
-        <w:br/>
-        <w:br/>
-        <w:br/>
-        <w:t>def run_sklearn_classifier():</w:t>
-        <w:br/>
-        <w:t xml:space="preserve">    texts = [t for t, _ in NOTES]</w:t>
-        <w:br/>
-        <w:t xml:space="preserve">    y = [1 if label == 'urgent' else 0 for _, label in NOTES]</w:t>
-        <w:br/>
-        <w:br/>
-        <w:t xml:space="preserve">    X_train, X_test, y_train, y_test = train_test_split(</w:t>
-        <w:br/>
-        <w:t xml:space="preserve">        texts, y, test_size=0.25, random_state=42, stratify=y</w:t>
-        <w:br/>
-        <w:t xml:space="preserve">    )</w:t>
-        <w:br/>
-        <w:br/>
-        <w:t xml:space="preserve">    model = Pipeline([</w:t>
-        <w:br/>
-        <w:t xml:space="preserve">        ('tfidf', TfidfVectorizer(ngram_range=(1, 2), min_df=1)),</w:t>
-        <w:br/>
-        <w:t xml:space="preserve">        ('clf', LogisticRegression(max_iter=300, random_state=42))</w:t>
-        <w:br/>
-        <w:t xml:space="preserve">    ])</w:t>
-        <w:br/>
-        <w:br/>
-        <w:t xml:space="preserve">    model.fit(X_train, y_train)</w:t>
-        <w:br/>
-        <w:t xml:space="preserve">    pred = model.predict(X_test)</w:t>
-        <w:br/>
-        <w:br/>
-        <w:t xml:space="preserve">    print('Accuracy:', round(accuracy_score(y_test, pred), 3))</w:t>
-        <w:br/>
-        <w:t xml:space="preserve">    print('Confusion matrix:\\n', confusion_matrix(y_test, pred))</w:t>
-        <w:br/>
-        <w:t xml:space="preserve">    print('Classification report:\\n', classification_report(</w:t>
-        <w:br/>
-        <w:t xml:space="preserve">        y_test, pred, target_names=['routine', 'urgent'], digits=3</w:t>
-        <w:br/>
-        <w:t xml:space="preserve">    ))</w:t>
-        <w:br/>
-        <w:br/>
-        <w:t xml:space="preserve">    new_note = 'patient with crushing chest pain and sweating'</w:t>
-        <w:br/>
-        <w:t xml:space="preserve">    new_pred = model.predict([new_note])[0]</w:t>
-        <w:br/>
-        <w:t xml:space="preserve">    print('New note prediction:', 'urgent' if new_pred == 1 else 'routine')</w:t>
-        <w:br/>
-        <w:br/>
-        <w:br/>
-        <w:t>if __name__ == '__main__':</w:t>
-        <w:br/>
-        <w:t xml:space="preserve">    run_nltk_analysis('task3_token_chart.png')</w:t>
-        <w:br/>
-        <w:t xml:space="preserve">    run_sklearn_classifier()</w:t>
-        <w:br/>
-      </w:r>
-    </w:p>
-    <w:p>
-      <w:pPr>
-        <w:pStyle w:val="Heading3"/>
-      </w:pPr>
-      <w:r>
-        <w:t>Appendix B: Full output produced by Task 3 script</w:t>
-      </w:r>
-    </w:p>
-    <w:p>
-      <w:r>
-        <w:t>/home/ubuntu/.local/lib/python3.12/site-packages/sklearn/metrics/_classification.py:1879: UndefinedMetricWarning: Precision is ill-defined and being set to 0.0 in labels with no predicted samples. Use `zero_division` parameter to control this behavior.</w:t>
-        <w:br/>
-        <w:t xml:space="preserve">  _warn_prf(average, modifier, f"{metric.capitalize()} is", result.shape[0])</w:t>
-        <w:br/>
-        <w:t>/home/ubuntu/.local/lib/python3.12/site-packages/sklearn/metrics/_classification.py:1879: UndefinedMetricWarning: Precision is ill-defined and being set to 0.0 in labels with no predicted samples. Use `zero_division` parameter to control this behavior.</w:t>
-        <w:br/>
-        <w:t xml:space="preserve">  _warn_prf(average, modifier, f"{metric.capitalize()} is", result.shape[0])</w:t>
-        <w:br/>
-        <w:t>/home/ubuntu/.local/lib/python3.12/site-packages/sklearn/metrics/_classification.py:1879: UndefinedMetricWarning: Precision is ill-defined and being set to 0.0 in labels with no predicted samples. Use `zero_division` parameter to control this behavior.</w:t>
-        <w:br/>
-        <w:t xml:space="preserve">  _warn_prf(average, modifier, f"{metric.capitalize()} is", result.shape[0])</w:t>
-        <w:br/>
-        <w:t>Top urgent tokens: [('chest', 2), ('crushing', 1), ('pain', 1), ('radiating', 1), ('left', 1), ('arm', 1), ('sweating', 1), ('nausea', 1)]</w:t>
-        <w:br/>
-        <w:t>Top routine tokens: [('mild', 2), ('ankle', 1), ('sprain', 1), ('fall', 1), ('able', 1), ('bear', 1), ('weight', 1), ('sore', 1)]</w:t>
-        <w:br/>
         <w:t>Accuracy: 0.333</w:t>
         <w:br/>
         <w:t>Confusion matrix:\n [[0 2]</w:t>
@@ -1048,6 +832,13 @@
         <w:t>Student contribution: final interpretation, edits, and submission decisions completed by student.</w:t>
       </w:r>
     </w:p>
+    <w:p/>
+    <w:p/>
+    <w:p/>
+    <w:p/>
+    <w:p/>
+    <w:p/>
+    <w:p/>
     <w:sectPr>
       <w:pgSz w:w="12240" w:h="15840"/>
       <w:pgMar w:top="1440" w:right="1800" w:bottom="1440" w:left="1800" w:header="720" w:footer="720" w:gutter="0"/>

</xml_diff>